<commit_message>
Refactor GameRadar into use cases, handlers and Core repositories
Generate schemas from the approved API contract, add safe errors and logging, verify PostgreSQL concurrency, and update the project report.
</commit_message>
<xml_diff>
--- a/docs/GameRadar-report.docx
+++ b/docs/GameRadar-report.docx
@@ -158,7 +158,7 @@
         <w:rPr>
           <w:b w:val="0"/>
         </w:rPr>
-        <w:t>Дата проверки 6 октября 2026 года</w:t>
+        <w:t>Редакция 7 октября 2026 года</w:t>
       </w:r>
     </w:p>
     <w:p>
@@ -235,7 +235,7 @@
       </w:r>
       <w:r>
         <w:tab/>
-        <w:t>7</w:t>
+        <w:t>8</w:t>
       </w:r>
     </w:p>
     <w:p>
@@ -252,7 +252,7 @@
       </w:r>
       <w:r>
         <w:tab/>
-        <w:t>10</w:t>
+        <w:t>11</w:t>
       </w:r>
     </w:p>
     <w:p>
@@ -269,7 +269,7 @@
       </w:r>
       <w:r>
         <w:tab/>
-        <w:t>11</w:t>
+        <w:t>13</w:t>
       </w:r>
     </w:p>
     <w:p>
@@ -286,7 +286,7 @@
       </w:r>
       <w:r>
         <w:tab/>
-        <w:t>12</w:t>
+        <w:t>14</w:t>
       </w:r>
     </w:p>
     <w:p>
@@ -303,7 +303,7 @@
       </w:r>
       <w:r>
         <w:tab/>
-        <w:t>14</w:t>
+        <w:t>16</w:t>
       </w:r>
     </w:p>
     <w:p>
@@ -320,7 +320,7 @@
       </w:r>
       <w:r>
         <w:tab/>
-        <w:t>16</w:t>
+        <w:t>19</w:t>
       </w:r>
     </w:p>
     <w:p>
@@ -337,7 +337,7 @@
       </w:r>
       <w:r>
         <w:tab/>
-        <w:t>18</w:t>
+        <w:t>21</w:t>
       </w:r>
     </w:p>
     <w:p>
@@ -354,7 +354,7 @@
       </w:r>
       <w:r>
         <w:tab/>
-        <w:t>19</w:t>
+        <w:t>22</w:t>
       </w:r>
     </w:p>
     <w:p>
@@ -371,7 +371,7 @@
       </w:r>
       <w:r>
         <w:tab/>
-        <w:t>20</w:t>
+        <w:t>23</w:t>
       </w:r>
     </w:p>
     <w:p>
@@ -388,7 +388,7 @@
       </w:r>
       <w:r>
         <w:tab/>
-        <w:t>21</w:t>
+        <w:t>24</w:t>
       </w:r>
     </w:p>
     <w:p>
@@ -405,7 +405,7 @@
       </w:r>
       <w:r>
         <w:tab/>
-        <w:t>24</w:t>
+        <w:t>27</w:t>
       </w:r>
     </w:p>
     <w:p>
@@ -422,7 +422,7 @@
       </w:r>
       <w:r>
         <w:tab/>
-        <w:t>28</w:t>
+        <w:t>31</w:t>
       </w:r>
     </w:p>
     <w:p>
@@ -455,7 +455,7 @@
         <w:rPr>
           <w:b w:val="0"/>
         </w:rPr>
-        <w:t>Локальная проверка подтверждает работу API, PostgreSQL, мониторинга и двух выбранных модулей. Пайплайн Jenkins для двух машин подготовлен в коде. Его фактический запуск, публикация образа и откат между тегами ещё должны быть продемонстрированы перед сдачей.</w:t>
+        <w:t>7 октября архитектура переработана по схеме Pydantic DTO, неизменяемых Use Cases, Dispatcher, Handler и SQLAlchemy Core. Проверки PostgreSQL, контейнеров, мониторинга и модулей 6 октября относятся к исходной версии до этого изменения. Пайплайн Jenkins для двух машин подготовлен в коде. Его фактический запуск, публикация образа и откат между тегами ещё должны быть продемонстрированы перед сдачей.</w:t>
       </w:r>
     </w:p>
     <w:p>
@@ -512,7 +512,7 @@
         <w:rPr>
           <w:b w:val="0"/>
         </w:rPr>
-        <w:t>HTTP-слой проверяет запрос и ключ, вызывает Use Case и формирует ответ. Use Case выполняет один сценарий приложения и обращается к данным через порты. Domain содержит сущности и правила расчёта; SQLAlchemy и CheapShark являются адаптерами. Worker использует те же сценарии обновления, что и API.</w:t>
+        <w:t>HTTP-слой проверяет ключ, валидирует Pydantic DTO и строит Use Case. Use Case — frozen dataclass с данными команды или запроса, без выполнения операции. Dispatcher выбирает Handler по типу команды. Handler выполняет бизнес-правила, вызывает PriceProvider и управляет транзакцией Connection.begin(). Repository выполняет SQLAlchemy Core-запросы; ORM Session не используется. Worker передаёт команды в тот же Dispatcher.</w:t>
       </w:r>
     </w:p>
     <w:p>
@@ -528,7 +528,7 @@
       <w:r>
         <w:drawing>
           <wp:inline xmlns:a="http://schemas.openxmlformats.org/drawingml/2006/main" xmlns:pic="http://schemas.openxmlformats.org/drawingml/2006/picture">
-            <wp:extent cx="5832000" cy="2843100"/>
+            <wp:extent cx="5832000" cy="3645000"/>
             <wp:docPr id="1" name="Picture 1" descr="Рисунок 1 Компоненты Game Radar и направления взаимодействия"/>
             <wp:cNvGraphicFramePr>
               <a:graphicFrameLocks noChangeAspect="1"/>
@@ -549,7 +549,7 @@
                   <pic:spPr>
                     <a:xfrm>
                       <a:off x="0" y="0"/>
-                      <a:ext cx="5832000" cy="2843100"/>
+                      <a:ext cx="5832000" cy="3645000"/>
                     </a:xfrm>
                     <a:prstGeom prst="rect"/>
                   </pic:spPr>
@@ -612,7 +612,6 @@
           </w:tcPr>
           <w:p>
             <w:pPr>
-              <w:keepNext/>
               <w:spacing w:after="20" w:before="20" w:line="240" w:lineRule="auto"/>
             </w:pPr>
             <w:r>
@@ -638,7 +637,6 @@
           </w:tcPr>
           <w:p>
             <w:pPr>
-              <w:keepNext/>
               <w:spacing w:after="20" w:before="20" w:line="240" w:lineRule="auto"/>
             </w:pPr>
             <w:r>
@@ -664,7 +662,6 @@
           </w:tcPr>
           <w:p>
             <w:pPr>
-              <w:keepNext/>
               <w:spacing w:after="20" w:before="20" w:line="240" w:lineRule="auto"/>
             </w:pPr>
             <w:r>
@@ -695,7 +692,6 @@
           </w:tcPr>
           <w:p>
             <w:pPr>
-              <w:keepNext/>
               <w:spacing w:after="20" w:before="20" w:line="240" w:lineRule="auto"/>
             </w:pPr>
             <w:r>
@@ -703,7 +699,7 @@
                 <w:b w:val="0"/>
                 <w:sz w:val="20"/>
               </w:rPr>
-              <w:t>Domain</w:t>
+              <w:t>HTTP и DTO</w:t>
             </w:r>
           </w:p>
         </w:tc>
@@ -721,7 +717,6 @@
           </w:tcPr>
           <w:p>
             <w:pPr>
-              <w:keepNext/>
               <w:spacing w:after="20" w:before="20" w:line="240" w:lineRule="auto"/>
             </w:pPr>
             <w:r>
@@ -729,7 +724,7 @@
                 <w:b w:val="0"/>
                 <w:sz w:val="20"/>
               </w:rPr>
-              <w:t>app/domain</w:t>
+              <w:t>app/api, app/schemas</w:t>
             </w:r>
           </w:p>
         </w:tc>
@@ -747,7 +742,6 @@
           </w:tcPr>
           <w:p>
             <w:pPr>
-              <w:keepNext/>
               <w:spacing w:after="20" w:before="20" w:line="240" w:lineRule="auto"/>
             </w:pPr>
             <w:r>
@@ -755,7 +749,7 @@
                 <w:b w:val="0"/>
                 <w:sz w:val="20"/>
               </w:rPr>
-              <w:t>Сущности, выбор цены, порог, сводка</w:t>
+              <w:t>Авторизация, валидация, JSON-ответ</w:t>
             </w:r>
           </w:p>
         </w:tc>
@@ -778,7 +772,6 @@
           </w:tcPr>
           <w:p>
             <w:pPr>
-              <w:keepNext/>
               <w:spacing w:after="20" w:before="20" w:line="240" w:lineRule="auto"/>
             </w:pPr>
             <w:r>
@@ -786,7 +779,7 @@
                 <w:b w:val="0"/>
                 <w:sz w:val="20"/>
               </w:rPr>
-              <w:t>Application</w:t>
+              <w:t>Use Case</w:t>
             </w:r>
           </w:p>
         </w:tc>
@@ -804,7 +797,6 @@
           </w:tcPr>
           <w:p>
             <w:pPr>
-              <w:keepNext/>
               <w:spacing w:after="20" w:before="20" w:line="240" w:lineRule="auto"/>
             </w:pPr>
             <w:r>
@@ -812,7 +804,7 @@
                 <w:b w:val="0"/>
                 <w:sz w:val="20"/>
               </w:rPr>
-              <w:t>app/application/use_cases</w:t>
+              <w:t>app/usecases</w:t>
             </w:r>
           </w:p>
         </w:tc>
@@ -830,7 +822,6 @@
           </w:tcPr>
           <w:p>
             <w:pPr>
-              <w:keepNext/>
               <w:spacing w:after="20" w:before="20" w:line="240" w:lineRule="auto"/>
             </w:pPr>
             <w:r>
@@ -838,7 +829,7 @@
                 <w:b w:val="0"/>
                 <w:sz w:val="20"/>
               </w:rPr>
-              <w:t>Сценарии и управление операциями</w:t>
+              <w:t>Frozen Command/Query: только данные</w:t>
             </w:r>
           </w:p>
         </w:tc>
@@ -861,7 +852,6 @@
           </w:tcPr>
           <w:p>
             <w:pPr>
-              <w:keepNext/>
               <w:spacing w:after="20" w:before="20" w:line="240" w:lineRule="auto"/>
             </w:pPr>
             <w:r>
@@ -869,7 +859,7 @@
                 <w:b w:val="0"/>
                 <w:sz w:val="20"/>
               </w:rPr>
-              <w:t>Порты</w:t>
+              <w:t>Dispatcher</w:t>
             </w:r>
           </w:p>
         </w:tc>
@@ -887,7 +877,6 @@
           </w:tcPr>
           <w:p>
             <w:pPr>
-              <w:keepNext/>
               <w:spacing w:after="20" w:before="20" w:line="240" w:lineRule="auto"/>
             </w:pPr>
             <w:r>
@@ -895,7 +884,7 @@
                 <w:b w:val="0"/>
                 <w:sz w:val="20"/>
               </w:rPr>
-              <w:t>app/application/ports.py</w:t>
+              <w:t>app/dispatcher.py</w:t>
             </w:r>
           </w:p>
         </w:tc>
@@ -913,7 +902,6 @@
           </w:tcPr>
           <w:p>
             <w:pPr>
-              <w:keepNext/>
               <w:spacing w:after="20" w:before="20" w:line="240" w:lineRule="auto"/>
             </w:pPr>
             <w:r>
@@ -921,7 +909,7 @@
                 <w:b w:val="0"/>
                 <w:sz w:val="20"/>
               </w:rPr>
-              <w:t>Repository, UnitOfWork, PriceProvider</w:t>
+              <w:t>Registry: тип Use Case → Handler</w:t>
             </w:r>
           </w:p>
         </w:tc>
@@ -944,7 +932,6 @@
           </w:tcPr>
           <w:p>
             <w:pPr>
-              <w:keepNext/>
               <w:spacing w:after="20" w:before="20" w:line="240" w:lineRule="auto"/>
             </w:pPr>
             <w:r>
@@ -952,7 +939,7 @@
                 <w:b w:val="0"/>
                 <w:sz w:val="20"/>
               </w:rPr>
-              <w:t>Адаптер БД</w:t>
+              <w:t>Registrar</w:t>
             </w:r>
           </w:p>
         </w:tc>
@@ -970,7 +957,6 @@
           </w:tcPr>
           <w:p>
             <w:pPr>
-              <w:keepNext/>
               <w:spacing w:after="20" w:before="20" w:line="240" w:lineRule="auto"/>
             </w:pPr>
             <w:r>
@@ -978,7 +964,7 @@
                 <w:b w:val="0"/>
                 <w:sz w:val="20"/>
               </w:rPr>
-              <w:t>app/infrastructure/repositories.py</w:t>
+              <w:t>app/dependencies/dispatcher_register.py</w:t>
             </w:r>
           </w:p>
         </w:tc>
@@ -996,7 +982,6 @@
           </w:tcPr>
           <w:p>
             <w:pPr>
-              <w:keepNext/>
               <w:spacing w:after="20" w:before="20" w:line="240" w:lineRule="auto"/>
             </w:pPr>
             <w:r>
@@ -1004,7 +989,7 @@
                 <w:b w:val="0"/>
                 <w:sz w:val="20"/>
               </w:rPr>
-              <w:t>SQLAlchemy и транзакции</w:t>
+              <w:t>Общие зависимости и регистрация .handle</w:t>
             </w:r>
           </w:p>
         </w:tc>
@@ -1027,7 +1012,6 @@
           </w:tcPr>
           <w:p>
             <w:pPr>
-              <w:keepNext/>
               <w:spacing w:after="20" w:before="20" w:line="240" w:lineRule="auto"/>
             </w:pPr>
             <w:r>
@@ -1035,7 +1019,7 @@
                 <w:b w:val="0"/>
                 <w:sz w:val="20"/>
               </w:rPr>
-              <w:t>Адаптер API</w:t>
+              <w:t>Handler</w:t>
             </w:r>
           </w:p>
         </w:tc>
@@ -1053,7 +1037,6 @@
           </w:tcPr>
           <w:p>
             <w:pPr>
-              <w:keepNext/>
               <w:spacing w:after="20" w:before="20" w:line="240" w:lineRule="auto"/>
             </w:pPr>
             <w:r>
@@ -1061,7 +1044,7 @@
                 <w:b w:val="0"/>
                 <w:sz w:val="20"/>
               </w:rPr>
-              <w:t>app/providers.py</w:t>
+              <w:t>app/usecase_handlers</w:t>
             </w:r>
           </w:p>
         </w:tc>
@@ -1079,7 +1062,6 @@
           </w:tcPr>
           <w:p>
             <w:pPr>
-              <w:keepNext/>
               <w:spacing w:after="20" w:before="20" w:line="240" w:lineRule="auto"/>
             </w:pPr>
             <w:r>
@@ -1087,7 +1069,7 @@
                 <w:b w:val="0"/>
                 <w:sz w:val="20"/>
               </w:rPr>
-              <w:t>CheapShark или автономный mock</w:t>
+              <w:t>Бизнес-правила и транзакция</w:t>
             </w:r>
           </w:p>
         </w:tc>
@@ -1110,7 +1092,6 @@
           </w:tcPr>
           <w:p>
             <w:pPr>
-              <w:keepNext w:val="0"/>
               <w:spacing w:after="20" w:before="20" w:line="240" w:lineRule="auto"/>
             </w:pPr>
             <w:r>
@@ -1118,7 +1099,7 @@
                 <w:b w:val="0"/>
                 <w:sz w:val="20"/>
               </w:rPr>
-              <w:t>HTTP</w:t>
+              <w:t>Service</w:t>
             </w:r>
           </w:p>
         </w:tc>
@@ -1136,7 +1117,6 @@
           </w:tcPr>
           <w:p>
             <w:pPr>
-              <w:keepNext w:val="0"/>
               <w:spacing w:after="20" w:before="20" w:line="240" w:lineRule="auto"/>
             </w:pPr>
             <w:r>
@@ -1144,7 +1124,7 @@
                 <w:b w:val="0"/>
                 <w:sz w:val="20"/>
               </w:rPr>
-              <w:t>app/api</w:t>
+              <w:t>app/services</w:t>
             </w:r>
           </w:p>
         </w:tc>
@@ -1162,7 +1142,6 @@
           </w:tcPr>
           <w:p>
             <w:pPr>
-              <w:keepNext w:val="0"/>
               <w:spacing w:after="20" w:before="20" w:line="240" w:lineRule="auto"/>
             </w:pPr>
             <w:r>
@@ -1170,7 +1149,327 @@
                 <w:b w:val="0"/>
                 <w:sz w:val="20"/>
               </w:rPr>
-              <w:t>Валидация, ключ и представление ответа</w:t>
+              <w:t>Общий GameRefreshService</w:t>
+            </w:r>
+          </w:p>
+        </w:tc>
+      </w:tr>
+      <w:tr>
+        <w:trPr>
+          <w:cantSplit/>
+        </w:trPr>
+        <w:tc>
+          <w:tcPr>
+            <w:tcW w:type="dxa" w:w="1304"/>
+            <w:vAlign w:val="center"/>
+            <w:shd w:fill="FFFFFF"/>
+            <w:tcMar>
+              <w:top w:w="60" w:type="dxa"/>
+              <w:left w:w="90" w:type="dxa"/>
+              <w:bottom w:w="60" w:type="dxa"/>
+              <w:right w:w="90" w:type="dxa"/>
+            </w:tcMar>
+          </w:tcPr>
+          <w:p>
+            <w:pPr>
+              <w:spacing w:after="20" w:before="20" w:line="240" w:lineRule="auto"/>
+            </w:pPr>
+            <w:r>
+              <w:rPr>
+                <w:b w:val="0"/>
+                <w:sz w:val="20"/>
+              </w:rPr>
+              <w:t>Repository</w:t>
+            </w:r>
+          </w:p>
+        </w:tc>
+        <w:tc>
+          <w:tcPr>
+            <w:tcW w:type="dxa" w:w="3458"/>
+            <w:vAlign w:val="center"/>
+            <w:shd w:fill="FFFFFF"/>
+            <w:tcMar>
+              <w:top w:w="60" w:type="dxa"/>
+              <w:left w:w="90" w:type="dxa"/>
+              <w:bottom w:w="60" w:type="dxa"/>
+              <w:right w:w="90" w:type="dxa"/>
+            </w:tcMar>
+          </w:tcPr>
+          <w:p>
+            <w:pPr>
+              <w:spacing w:after="20" w:before="20" w:line="240" w:lineRule="auto"/>
+            </w:pPr>
+            <w:r>
+              <w:rPr>
+                <w:b w:val="0"/>
+                <w:sz w:val="20"/>
+              </w:rPr>
+              <w:t>app/repositories</w:t>
+            </w:r>
+          </w:p>
+        </w:tc>
+        <w:tc>
+          <w:tcPr>
+            <w:tcW w:type="dxa" w:w="4479"/>
+            <w:vAlign w:val="center"/>
+            <w:shd w:fill="FFFFFF"/>
+            <w:tcMar>
+              <w:top w:w="60" w:type="dxa"/>
+              <w:left w:w="90" w:type="dxa"/>
+              <w:bottom w:w="60" w:type="dxa"/>
+              <w:right w:w="90" w:type="dxa"/>
+            </w:tcMar>
+          </w:tcPr>
+          <w:p>
+            <w:pPr>
+              <w:spacing w:after="20" w:before="20" w:line="240" w:lineRule="auto"/>
+            </w:pPr>
+            <w:r>
+              <w:rPr>
+                <w:b w:val="0"/>
+                <w:sz w:val="20"/>
+              </w:rPr>
+              <w:t>Core Connection, SQL и маппинг</w:t>
+            </w:r>
+          </w:p>
+        </w:tc>
+      </w:tr>
+      <w:tr>
+        <w:trPr>
+          <w:cantSplit/>
+        </w:trPr>
+        <w:tc>
+          <w:tcPr>
+            <w:tcW w:type="dxa" w:w="1304"/>
+            <w:vAlign w:val="center"/>
+            <w:shd w:fill="F5F7FA"/>
+            <w:tcMar>
+              <w:top w:w="60" w:type="dxa"/>
+              <w:left w:w="90" w:type="dxa"/>
+              <w:bottom w:w="60" w:type="dxa"/>
+              <w:right w:w="90" w:type="dxa"/>
+            </w:tcMar>
+          </w:tcPr>
+          <w:p>
+            <w:pPr>
+              <w:spacing w:after="20" w:before="20" w:line="240" w:lineRule="auto"/>
+            </w:pPr>
+            <w:r>
+              <w:rPr>
+                <w:b w:val="0"/>
+                <w:sz w:val="20"/>
+              </w:rPr>
+              <w:t>Адаптер</w:t>
+            </w:r>
+          </w:p>
+        </w:tc>
+        <w:tc>
+          <w:tcPr>
+            <w:tcW w:type="dxa" w:w="3458"/>
+            <w:vAlign w:val="center"/>
+            <w:shd w:fill="F5F7FA"/>
+            <w:tcMar>
+              <w:top w:w="60" w:type="dxa"/>
+              <w:left w:w="90" w:type="dxa"/>
+              <w:bottom w:w="60" w:type="dxa"/>
+              <w:right w:w="90" w:type="dxa"/>
+            </w:tcMar>
+          </w:tcPr>
+          <w:p>
+            <w:pPr>
+              <w:spacing w:after="20" w:before="20" w:line="240" w:lineRule="auto"/>
+            </w:pPr>
+            <w:r>
+              <w:rPr>
+                <w:b w:val="0"/>
+                <w:sz w:val="20"/>
+              </w:rPr>
+              <w:t>app/adapters</w:t>
+            </w:r>
+          </w:p>
+        </w:tc>
+        <w:tc>
+          <w:tcPr>
+            <w:tcW w:type="dxa" w:w="4479"/>
+            <w:vAlign w:val="center"/>
+            <w:shd w:fill="F5F7FA"/>
+            <w:tcMar>
+              <w:top w:w="60" w:type="dxa"/>
+              <w:left w:w="90" w:type="dxa"/>
+              <w:bottom w:w="60" w:type="dxa"/>
+              <w:right w:w="90" w:type="dxa"/>
+            </w:tcMar>
+          </w:tcPr>
+          <w:p>
+            <w:pPr>
+              <w:spacing w:after="20" w:before="20" w:line="240" w:lineRule="auto"/>
+            </w:pPr>
+            <w:r>
+              <w:rPr>
+                <w:b w:val="0"/>
+                <w:sz w:val="20"/>
+              </w:rPr>
+              <w:t>Порт цен и CheapShark/Mock</w:t>
+            </w:r>
+          </w:p>
+        </w:tc>
+      </w:tr>
+      <w:tr>
+        <w:trPr>
+          <w:cantSplit/>
+        </w:trPr>
+        <w:tc>
+          <w:tcPr>
+            <w:tcW w:type="dxa" w:w="1304"/>
+            <w:vAlign w:val="center"/>
+            <w:shd w:fill="FFFFFF"/>
+            <w:tcMar>
+              <w:top w:w="60" w:type="dxa"/>
+              <w:left w:w="90" w:type="dxa"/>
+              <w:bottom w:w="60" w:type="dxa"/>
+              <w:right w:w="90" w:type="dxa"/>
+            </w:tcMar>
+          </w:tcPr>
+          <w:p>
+            <w:pPr>
+              <w:spacing w:after="20" w:before="20" w:line="240" w:lineRule="auto"/>
+            </w:pPr>
+            <w:r>
+              <w:rPr>
+                <w:b w:val="0"/>
+                <w:sz w:val="20"/>
+              </w:rPr>
+              <w:t>Таблицы</w:t>
+            </w:r>
+          </w:p>
+        </w:tc>
+        <w:tc>
+          <w:tcPr>
+            <w:tcW w:type="dxa" w:w="3458"/>
+            <w:vAlign w:val="center"/>
+            <w:shd w:fill="FFFFFF"/>
+            <w:tcMar>
+              <w:top w:w="60" w:type="dxa"/>
+              <w:left w:w="90" w:type="dxa"/>
+              <w:bottom w:w="60" w:type="dxa"/>
+              <w:right w:w="90" w:type="dxa"/>
+            </w:tcMar>
+          </w:tcPr>
+          <w:p>
+            <w:pPr>
+              <w:spacing w:after="20" w:before="20" w:line="240" w:lineRule="auto"/>
+            </w:pPr>
+            <w:r>
+              <w:rPr>
+                <w:b w:val="0"/>
+                <w:sz w:val="20"/>
+              </w:rPr>
+              <w:t>app/models/tables.py</w:t>
+            </w:r>
+          </w:p>
+        </w:tc>
+        <w:tc>
+          <w:tcPr>
+            <w:tcW w:type="dxa" w:w="4479"/>
+            <w:vAlign w:val="center"/>
+            <w:shd w:fill="FFFFFF"/>
+            <w:tcMar>
+              <w:top w:w="60" w:type="dxa"/>
+              <w:left w:w="90" w:type="dxa"/>
+              <w:bottom w:w="60" w:type="dxa"/>
+              <w:right w:w="90" w:type="dxa"/>
+            </w:tcMar>
+          </w:tcPr>
+          <w:p>
+            <w:pPr>
+              <w:spacing w:after="20" w:before="20" w:line="240" w:lineRule="auto"/>
+            </w:pPr>
+            <w:r>
+              <w:rPr>
+                <w:b w:val="0"/>
+                <w:sz w:val="20"/>
+              </w:rPr>
+              <w:t>Table и MetaData из sqlacodegen</w:t>
+            </w:r>
+          </w:p>
+        </w:tc>
+      </w:tr>
+      <w:tr>
+        <w:trPr>
+          <w:cantSplit/>
+        </w:trPr>
+        <w:tc>
+          <w:tcPr>
+            <w:tcW w:type="dxa" w:w="1304"/>
+            <w:vAlign w:val="center"/>
+            <w:shd w:fill="F5F7FA"/>
+            <w:tcMar>
+              <w:top w:w="60" w:type="dxa"/>
+              <w:left w:w="90" w:type="dxa"/>
+              <w:bottom w:w="60" w:type="dxa"/>
+              <w:right w:w="90" w:type="dxa"/>
+            </w:tcMar>
+          </w:tcPr>
+          <w:p>
+            <w:pPr>
+              <w:spacing w:after="20" w:before="20" w:line="240" w:lineRule="auto"/>
+            </w:pPr>
+            <w:r>
+              <w:rPr>
+                <w:b w:val="0"/>
+                <w:sz w:val="20"/>
+              </w:rPr>
+              <w:t>Views</w:t>
+            </w:r>
+          </w:p>
+        </w:tc>
+        <w:tc>
+          <w:tcPr>
+            <w:tcW w:type="dxa" w:w="3458"/>
+            <w:vAlign w:val="center"/>
+            <w:shd w:fill="F5F7FA"/>
+            <w:tcMar>
+              <w:top w:w="60" w:type="dxa"/>
+              <w:left w:w="90" w:type="dxa"/>
+              <w:bottom w:w="60" w:type="dxa"/>
+              <w:right w:w="90" w:type="dxa"/>
+            </w:tcMar>
+          </w:tcPr>
+          <w:p>
+            <w:pPr>
+              <w:spacing w:after="20" w:before="20" w:line="240" w:lineRule="auto"/>
+            </w:pPr>
+            <w:r>
+              <w:rPr>
+                <w:b w:val="0"/>
+                <w:sz w:val="20"/>
+              </w:rPr>
+              <w:t>app/domain/entities.py</w:t>
+            </w:r>
+          </w:p>
+        </w:tc>
+        <w:tc>
+          <w:tcPr>
+            <w:tcW w:type="dxa" w:w="4479"/>
+            <w:vAlign w:val="center"/>
+            <w:shd w:fill="F5F7FA"/>
+            <w:tcMar>
+              <w:top w:w="60" w:type="dxa"/>
+              <w:left w:w="90" w:type="dxa"/>
+              <w:bottom w:w="60" w:type="dxa"/>
+              <w:right w:w="90" w:type="dxa"/>
+            </w:tcMar>
+          </w:tcPr>
+          <w:p>
+            <w:pPr>
+              <w:spacing w:after="20" w:before="20" w:line="240" w:lineRule="auto"/>
+            </w:pPr>
+            <w:r>
+              <w:rPr>
+                <w:b w:val="0"/>
+                <w:sz w:val="20"/>
+              </w:rPr>
+              <w:t>Dataclass-представления результата</w:t>
             </w:r>
           </w:p>
         </w:tc>
@@ -1197,7 +1496,7 @@
         <w:pageBreakBefore/>
       </w:pPr>
       <w:r>
-        <w:t>Use Cases и бизнес правила</w:t>
+        <w:t>Команды и обработчики бизнес правил</w:t>
       </w:r>
     </w:p>
     <w:tbl>
@@ -1303,7 +1602,7 @@
                 <w:b w:val="0"/>
                 <w:sz w:val="20"/>
               </w:rPr>
-              <w:t>SearchGames и GetGame</w:t>
+              <w:t>SearchGamesUseCase и GetGameUseCase</w:t>
             </w:r>
           </w:p>
         </w:tc>
@@ -1360,7 +1659,7 @@
                 <w:b w:val="0"/>
                 <w:sz w:val="20"/>
               </w:rPr>
-              <w:t>CreateWatchlist и ListWatchlists</w:t>
+              <w:t>CreateWatchlistUseCase и ListWatchlistsUseCase</w:t>
             </w:r>
           </w:p>
         </w:tc>
@@ -1417,7 +1716,7 @@
                 <w:b w:val="0"/>
                 <w:sz w:val="20"/>
               </w:rPr>
-              <w:t>AddWatchlistItem и UpdateWatchlistItem</w:t>
+              <w:t>AddWatchlistItemUseCase и UpdateWatchlistItemUseCase</w:t>
             </w:r>
           </w:p>
         </w:tc>
@@ -1474,7 +1773,7 @@
                 <w:b w:val="0"/>
                 <w:sz w:val="20"/>
               </w:rPr>
-              <w:t>GetWatchlistSummary и GetNotifications</w:t>
+              <w:t>GetWatchlistSummaryUseCase и GetNotificationsUseCase</w:t>
             </w:r>
           </w:p>
         </w:tc>
@@ -1531,7 +1830,7 @@
                 <w:b w:val="0"/>
                 <w:sz w:val="20"/>
               </w:rPr>
-              <w:t>GetPriceHistory</w:t>
+              <w:t>GetPriceHistoryUseCase</w:t>
             </w:r>
           </w:p>
         </w:tc>
@@ -1588,7 +1887,7 @@
                 <w:b w:val="0"/>
                 <w:sz w:val="20"/>
               </w:rPr>
-              <w:t>RefreshWatchlist и RefreshAllWatchedGames</w:t>
+              <w:t>RefreshWatchlistUseCase и RefreshAllWatchedGamesUseCase</w:t>
             </w:r>
           </w:p>
         </w:tc>
@@ -1640,7 +1939,15 @@
         <w:rPr>
           <w:b w:val="0"/>
         </w:rPr>
-        <w:t>При добавлении игры сценарий сначала проверяет существование wishlist и отсутствие дубликата. Затем получает предложения из свежего кэша либо обновляет их; снимки цен сохраняются только при обновлении. Сценарий создаёт элемент, проверяет порог и фиксирует транзакцию. Для steam_only выбирается store_id=1. Равенство текущей и желаемой цены считается достижением порога.</w:t>
+        <w:t>Контракты сгруппированы по домену, каждый класс заканчивается на UseCase. Каждый Handler расположен в отдельном файле usecase_handlers/&lt;domain&gt;/&lt;action&gt;.py. DispatcherRegistrar создаёт общие зависимости и регистрирует метод .handle. GameRefreshService объединяет обновление предложений и кэша; границы транзакции остаются в Handler.</w:t>
+      </w:r>
+    </w:p>
+    <w:p>
+      <w:r>
+        <w:rPr>
+          <w:b w:val="0"/>
+        </w:rPr>
+        <w:t>При добавлении игры Handler сначала проверяет существование wishlist и отсутствие дубликата. Затем получает предложения из свежего кэша либо обновляет их; снимки цен сохраняются только при обновлении. Handler создаёт элемент, проверяет порог и завершает транзакцию. Repository получает Connection при создании и не вызывает commit, rollback или flush. Для steam_only выбирается store_id=1. Равенство текущей и желаемой цены считается достижением порога.</w:t>
       </w:r>
     </w:p>
     <w:p>
@@ -1657,6 +1964,22 @@
           <w:b w:val="0"/>
         </w:rPr>
         <w:t>CheapShark использует фиксированный адрес, timeout, ограничение частоты, кэш поиска и Retry-After. Ошибка провайдера преобразуется в контролируемый HTTP 503. MockProvider не создаёт HTTP-клиент и применяется во всех нагрузочных тестах.</w:t>
+      </w:r>
+    </w:p>
+    <w:p>
+      <w:r>
+        <w:rPr>
+          <w:b w:val="0"/>
+        </w:rPr>
+        <w:t>Отображение выполняется явно: Pydantic request DTO → frozen Use Case → значения Core-запросов → строки результата → dataclass View → response DTO. Pydantic не импортируется в Repository. Входные схемы поддерживают camelCase и прежние snake_case имена; ответы согласованного API используют camelCase.</w:t>
+      </w:r>
+    </w:p>
+    <w:p>
+      <w:r>
+        <w:rPr>
+          <w:b w:val="0"/>
+        </w:rPr>
+        <w:t>Core-строки отображаются в Views через app/repositories/mapping.py, а Views в response DTO — через app/mappers/responses.py. Чистые вычисления цены и порога находятся в app/domain/pricing.py и вызываются обработчиками. Pydantic DTO также неизменяемы (frozen=True); команды содержат уже проверенные request DTO.</w:t>
       </w:r>
     </w:p>
     <w:p>
@@ -1674,6 +1997,53 @@
           <w:b w:val="0"/>
         </w:rPr>
         <w:t>Основная БД — PostgreSQL. Миграции управляются Alembic; исходная версия схемы f56047282f20. Цены хранятся в Numeric с двумя десятичными знаками. В API Decimal сериализуется строкой, чтобы не вводить погрешность float.</w:t>
+      </w:r>
+    </w:p>
+    <w:p>
+      <w:r>
+        <w:rPr>
+          <w:b w:val="0"/>
+        </w:rPr>
+        <w:t>app/models/tables.py сгенерирован sqlacodegen 3.2.0 TablesGenerator из объектов схемы исходной миграции f56047282f20. Это не интроспекция живой PostgreSQL. Скрипт scripts/generate_models.py поддерживает также отражение мигрированной БД по DATABASE_URL. Генерация не заменяет Alembic; проверено соответствие типов, индексов и ограничений исходной миграции, а также миграция и сравнение metadata в отдельной SQLite.</w:t>
+      </w:r>
+    </w:p>
+    <w:p>
+      <w:pPr>
+        <w:spacing w:after="0" w:line="200" w:lineRule="exact"/>
+      </w:pPr>
+      <w:r>
+        <w:rPr>
+          <w:rFonts w:ascii="Liberation Mono" w:hAnsi="Liberation Mono"/>
+          <w:b w:val="0"/>
+          <w:sz w:val="17"/>
+        </w:rPr>
+        <w:t>uv run python scripts/generate_models.py --from-migration</w:t>
+      </w:r>
+    </w:p>
+    <w:p>
+      <w:pPr>
+        <w:spacing w:after="0" w:line="200" w:lineRule="exact"/>
+      </w:pPr>
+      <w:r>
+        <w:rPr>
+          <w:rFonts w:ascii="Liberation Mono" w:hAnsi="Liberation Mono"/>
+          <w:b w:val="0"/>
+          <w:sz w:val="17"/>
+        </w:rPr>
+        <w:t># Для отражения уже мигрированной БД: настройте DATABASE_URL</w:t>
+      </w:r>
+    </w:p>
+    <w:p>
+      <w:pPr>
+        <w:spacing w:after="100" w:line="200" w:lineRule="exact"/>
+      </w:pPr>
+      <w:r>
+        <w:rPr>
+          <w:rFonts w:ascii="Liberation Mono" w:hAnsi="Liberation Mono"/>
+          <w:b w:val="0"/>
+          <w:sz w:val="17"/>
+        </w:rPr>
+        <w:t>uv run python scripts/generate_models.py</w:t>
       </w:r>
     </w:p>
     <w:p>
@@ -2361,6 +2731,22 @@
       </w:r>
     </w:p>
     <w:p>
+      <w:r>
+        <w:rPr>
+          <w:b w:val="0"/>
+        </w:rPr>
+        <w:t>Обновление и изменение элементов используют порядок блокировок игра → родительский wishlist (FOR KEY SHARE) → элементы (FOR UPDATE). Родитель блокируется до дочерних строк, чтобы каскадное удаление wishlist не образовывало цикл ожидания с обновлением цены. Конкурентный сценарий проверяется отдельно от SQLite-тестов.</w:t>
+      </w:r>
+    </w:p>
+    <w:p>
+      <w:r>
+        <w:rPr>
+          <w:b w:val="0"/>
+        </w:rPr>
+        <w:t>После смены провайдера сводка может иметь source=mixed, если в списке остались наблюдения разных источников. Источник игры и снимка хранится отдельно; health показывает текущий режим провайдера.</w:t>
+      </w:r>
+    </w:p>
+    <w:p>
       <w:pPr>
         <w:pStyle w:val="Heading1"/>
         <w:pageBreakBefore/>
@@ -2374,7 +2760,41 @@
         <w:rPr>
           <w:b w:val="0"/>
         </w:rPr>
-        <w:t>Документация OpenAPI создаётся FastAPI. Локальный Swagger доступен по http://localhost:8000/docs, спецификация — /openapi.json. После развёртывания на второй машине адрес заменяется её именем или IP. Операции /games и /watchlists требуют X-API-Key; /health и /metrics открыты.</w:t>
+        <w:t>Источник API-схем — согласованный OpenAPI 3.1.0 контракт doc/game-radar-api.yaml, версия 0.2.0. scripts/generate_schemas.py генерирует Pydantic v2 модели в app/schemas/game_radar_api.py. Документация публикуется FastAPI. Локальный Swagger доступен по http://localhost:8000/docs, спецификация — /openapi.json. После развёртывания на второй машине адрес заменяется её именем или IP. Операции /games и /watchlists требуют X-API-Key; /health и /metrics открыты.</w:t>
+      </w:r>
+    </w:p>
+    <w:p>
+      <w:pPr>
+        <w:spacing w:after="0" w:line="200" w:lineRule="exact"/>
+      </w:pPr>
+      <w:r>
+        <w:rPr>
+          <w:rFonts w:ascii="Liberation Mono" w:hAnsi="Liberation Mono"/>
+          <w:b w:val="0"/>
+          <w:sz w:val="17"/>
+        </w:rPr>
+        <w:t>uv run python scripts/generate_schemas.py</w:t>
+      </w:r>
+    </w:p>
+    <w:p>
+      <w:pPr>
+        <w:spacing w:after="100" w:line="200" w:lineRule="exact"/>
+      </w:pPr>
+      <w:r>
+        <w:rPr>
+          <w:rFonts w:ascii="Liberation Mono" w:hAnsi="Liberation Mono"/>
+          <w:b w:val="0"/>
+          <w:sz w:val="17"/>
+        </w:rPr>
+        <w:t>uv run python scripts/generate_schemas.py --check</w:t>
+      </w:r>
+    </w:p>
+    <w:p>
+      <w:r>
+        <w:rPr>
+          <w:b w:val="0"/>
+        </w:rPr>
+        <w:t>Кодогенерация datamodel-codegen 0.83.0 сохраняет snake_case имена полей Python и camelCase aliases JSON. Неизменяемый DTO base, нормализация имени и PATCH-валидация, а также тип Money вынесены в app/schemas/base.py и app/schemas/types.py, чтобы перегенерация не стирала ручные правила.</w:t>
       </w:r>
     </w:p>
     <w:tbl>
@@ -3532,7 +3952,15 @@
           <w:b w:val="0"/>
           <w:sz w:val="17"/>
         </w:rPr>
-        <w:t>{"game_id":"612","target_price":"4.00","steam_only":true}</w:t>
+        <w:t>{"gameId":"612","targetPrice":"4.00","steamOnly":true}</w:t>
+      </w:r>
+    </w:p>
+    <w:p>
+      <w:r>
+        <w:rPr>
+          <w:b w:val="0"/>
+        </w:rPr>
+        <w:t>Для совместимости принимаются и game_id, target_price, steam_only. Канонический ответ содержит gameId, targetPrice, steamOnly; цены возвращаются строками. Исторические снимки ниже показывают прежний snake_case контракт исходной версии 6 октября.</w:t>
       </w:r>
     </w:p>
     <w:p>
@@ -3541,6 +3969,14 @@
           <w:b w:val="0"/>
         </w:rPr>
         <w:t>Ответ создания — 201; удаление — 204. Отсутствующий ресурс возвращает 404, повторное добавление игры — 409, некорректные данные — 422, отсутствующий или неверный ключ — 401. Порог отрицательный, NaN, Infinity или сумма с более чем двумя десятичными знаками отклоняется.</w:t>
+      </w:r>
+    </w:p>
+    <w:p>
+      <w:r>
+        <w:rPr>
+          <w:b w:val="0"/>
+        </w:rPr>
+        <w:t>Ошибки используют application/problem+json: type, title, status, detail, instance, traceId и code. Ошибка валидации дополнительно содержит errors с field, type и message. Ошибочные входные значения и секреты не включаются в ответ. JSON-журнал запросов хранит безопасные метаданные и traceId, позволяя сопоставить запрос с ошибкой.</w:t>
       </w:r>
     </w:p>
     <w:p>
@@ -3722,7 +4158,7 @@
         <w:rPr>
           <w:b w:val="0"/>
         </w:rPr>
-        <w:t>Снимки Swagger сделаны во время ручной демонстрации на локальном mock-стенде. Повторный refresh вернул HTTP 200 и notifications_created=0 при одном уже существовавшем событии, что подтверждает отсутствие дубликата. После демонстрации тестовый wishlist 4 удалён: DELETE вернул 204, последующий GET — 404.</w:t>
+        <w:t>Снимки Swagger сделаны 6 октября до Core-рефакторинга во время ручной демонстрации на локальном mock-стенде. Повторный refresh вернул HTTP 200 и notifications_created=0 при одном уже существовавшем событии, что подтверждает отсутствие дубликата. После демонстрации тестовый wishlist 4 удалён: DELETE вернул 204, последующий GET — 404.</w:t>
       </w:r>
     </w:p>
     <w:p>
@@ -3739,7 +4175,23 @@
         <w:rPr>
           <w:b w:val="0"/>
         </w:rPr>
+        <w:t>Контейнерная проверка 6 октября относится к версии до Core-рефакторинга. PostgreSQL-конкуренция и JMeter 7 октября выполнены до защиты ошибок запуска Settings; бизнес-логика не менялась. После этой правки итоговый образ повторно прошёл healthchecks db, API и worker, HTTP smoke и Trivy.</w:t>
+      </w:r>
+    </w:p>
+    <w:p>
+      <w:r>
+        <w:rPr>
+          <w:b w:val="0"/>
+        </w:rPr>
         <w:t>Dockerfile использует отдельные стадии base, uv, dependencies и runtime. Финальная база — Python 3.12.15 на Debian Trixie с обновлениями безопасности. Зависимости фиксируются uv.lock; runtime запускается с uid=10001(app). Контейнеры приложения имеют read_only, ограниченные capabilities и временный /tmp.</w:t>
+      </w:r>
+    </w:p>
+    <w:p>
+      <w:r>
+        <w:rPr>
+          <w:b w:val="0"/>
+        </w:rPr>
+        <w:t>Стандартный access log Uvicorn отключён (--no-access-log); используется JSON middleware с безопасными метаданными и traceId без содержимого ключей, request body и query-параметров. Settings скрывает значения в тексте ошибок запуска (hide_input_in_errors=True).</w:t>
       </w:r>
     </w:p>
     <w:p>
@@ -4446,7 +4898,7 @@
                 <w:b w:val="0"/>
                 <w:sz w:val="20"/>
               </w:rPr>
-              <w:t>Ruff check, format и pytest</w:t>
+              <w:t>Проверка generated DTO, Ruff check/format и pytest</w:t>
             </w:r>
           </w:p>
         </w:tc>
@@ -5388,6 +5840,14 @@
         <w:rPr>
           <w:b w:val="0"/>
         </w:rPr>
+        <w:t>Значения и снимок в этом разделе получены 6 октября для исходной версии. Мониторинг после изменения backend 7 октября не запускался.</w:t>
+      </w:r>
+    </w:p>
+    <w:p>
+      <w:r>
+        <w:rPr>
+          <w:b w:val="0"/>
+        </w:rPr>
         <w:t>Prometheus собирает метрики приложения, PostgreSQL Exporter и себя. Метрики HTTP используют шаблоны маршрутов, а не ID пользователя или игры. Это ограничивает число рядов. Grafana dashboard показывает RPS, p95, ошибки 5xx, соединения БД и готовность сервисов.</w:t>
       </w:r>
     </w:p>
@@ -5857,6 +6317,1401 @@
         <w:pStyle w:val="Heading2"/>
       </w:pPr>
       <w:r>
+        <w:t>Проверки после изменения архитектуры 7 октября</w:t>
+      </w:r>
+    </w:p>
+    <w:p>
+      <w:r>
+        <w:rPr>
+          <w:b w:val="0"/>
+        </w:rPr>
+        <w:t>7 октября после Core-рефакторинга и интеграции согласованного API-контракта полный pytest завершился результатом 134 passed. Зарегистрировано одно предупреждение Starlette/httpx об устаревшем API; оно не является ошибкой теста. Проверены frozen Use Cases, DispatcherRegistrar, обработчики, Core repositories и откат транзакций, DTO aliases и camelCase ответы, Problem Details, безопасный журнал, API-бизнес-сценарии и gate нагрузки. Ruff check/format, воспроизводимость Pydantic-кодогенерации и Core-таблиц прошли. Новая сборка проверена отдельно на PostgreSQL; прежние измерения 6 октября сохранены ниже для сравнения.</w:t>
+      </w:r>
+    </w:p>
+    <w:tbl>
+      <w:tblPr>
+        <w:tblW w:type="auto" w:w="0"/>
+        <w:jc w:val="center"/>
+        <w:tblLayout w:type="fixed"/>
+        <w:tblLook w:firstColumn="1" w:firstRow="1" w:lastColumn="0" w:lastRow="0" w:noHBand="0" w:noVBand="1" w:val="04A0"/>
+        <w:tblBorders>
+          <w:top w:val="single" w:sz="6" w:color="D9D9D9"/>
+          <w:left w:val="single" w:sz="6" w:color="D9D9D9"/>
+          <w:bottom w:val="single" w:sz="6" w:color="D9D9D9"/>
+          <w:right w:val="single" w:sz="6" w:color="D9D9D9"/>
+          <w:insideH w:val="single" w:sz="6" w:color="D9D9D9"/>
+          <w:insideV w:val="single" w:sz="6" w:color="D9D9D9"/>
+        </w:tblBorders>
+      </w:tblPr>
+      <w:tblGrid>
+        <w:gridCol w:w="4195"/>
+        <w:gridCol w:w="5046"/>
+      </w:tblGrid>
+      <w:tr>
+        <w:trPr>
+          <w:cantSplit/>
+          <w:tblHeader/>
+        </w:trPr>
+        <w:tc>
+          <w:tcPr>
+            <w:tcW w:type="dxa" w:w="4195"/>
+            <w:vAlign w:val="center"/>
+            <w:shd w:fill="DFE8F3"/>
+            <w:tcMar>
+              <w:top w:w="60" w:type="dxa"/>
+              <w:left w:w="90" w:type="dxa"/>
+              <w:bottom w:w="60" w:type="dxa"/>
+              <w:right w:w="90" w:type="dxa"/>
+            </w:tcMar>
+          </w:tcPr>
+          <w:p>
+            <w:pPr>
+              <w:spacing w:after="20" w:before="20" w:line="240" w:lineRule="auto"/>
+            </w:pPr>
+            <w:r>
+              <w:rPr>
+                <w:b/>
+                <w:sz w:val="20"/>
+              </w:rPr>
+              <w:t>Проверка обновлённой версии</w:t>
+            </w:r>
+          </w:p>
+        </w:tc>
+        <w:tc>
+          <w:tcPr>
+            <w:tcW w:type="dxa" w:w="5046"/>
+            <w:vAlign w:val="center"/>
+            <w:shd w:fill="DFE8F3"/>
+            <w:tcMar>
+              <w:top w:w="60" w:type="dxa"/>
+              <w:left w:w="90" w:type="dxa"/>
+              <w:bottom w:w="60" w:type="dxa"/>
+              <w:right w:w="90" w:type="dxa"/>
+            </w:tcMar>
+          </w:tcPr>
+          <w:p>
+            <w:pPr>
+              <w:spacing w:after="20" w:before="20" w:line="240" w:lineRule="auto"/>
+            </w:pPr>
+            <w:r>
+              <w:rPr>
+                <w:b/>
+                <w:sz w:val="20"/>
+              </w:rPr>
+              <w:t>Результат</w:t>
+            </w:r>
+          </w:p>
+        </w:tc>
+      </w:tr>
+      <w:tr>
+        <w:trPr>
+          <w:cantSplit/>
+        </w:trPr>
+        <w:tc>
+          <w:tcPr>
+            <w:tcW w:type="dxa" w:w="4195"/>
+            <w:vAlign w:val="center"/>
+            <w:shd w:fill="FFFFFF"/>
+            <w:tcMar>
+              <w:top w:w="60" w:type="dxa"/>
+              <w:left w:w="90" w:type="dxa"/>
+              <w:bottom w:w="60" w:type="dxa"/>
+              <w:right w:w="90" w:type="dxa"/>
+            </w:tcMar>
+          </w:tcPr>
+          <w:p>
+            <w:pPr>
+              <w:spacing w:after="20" w:before="20" w:line="240" w:lineRule="auto"/>
+            </w:pPr>
+            <w:r>
+              <w:rPr>
+                <w:b w:val="0"/>
+                <w:sz w:val="20"/>
+              </w:rPr>
+              <w:t>Дата и версия</w:t>
+            </w:r>
+          </w:p>
+        </w:tc>
+        <w:tc>
+          <w:tcPr>
+            <w:tcW w:type="dxa" w:w="5046"/>
+            <w:vAlign w:val="center"/>
+            <w:shd w:fill="FFFFFF"/>
+            <w:tcMar>
+              <w:top w:w="60" w:type="dxa"/>
+              <w:left w:w="90" w:type="dxa"/>
+              <w:bottom w:w="60" w:type="dxa"/>
+              <w:right w:w="90" w:type="dxa"/>
+            </w:tcMar>
+          </w:tcPr>
+          <w:p>
+            <w:pPr>
+              <w:spacing w:after="20" w:before="20" w:line="240" w:lineRule="auto"/>
+            </w:pPr>
+            <w:r>
+              <w:rPr>
+                <w:b w:val="0"/>
+                <w:sz w:val="20"/>
+              </w:rPr>
+              <w:t>7 октября; SQLAlchemy Core и API 0.2.0</w:t>
+            </w:r>
+          </w:p>
+        </w:tc>
+      </w:tr>
+      <w:tr>
+        <w:trPr>
+          <w:cantSplit/>
+        </w:trPr>
+        <w:tc>
+          <w:tcPr>
+            <w:tcW w:type="dxa" w:w="4195"/>
+            <w:vAlign w:val="center"/>
+            <w:shd w:fill="F5F7FA"/>
+            <w:tcMar>
+              <w:top w:w="60" w:type="dxa"/>
+              <w:left w:w="90" w:type="dxa"/>
+              <w:bottom w:w="60" w:type="dxa"/>
+              <w:right w:w="90" w:type="dxa"/>
+            </w:tcMar>
+          </w:tcPr>
+          <w:p>
+            <w:pPr>
+              <w:spacing w:after="20" w:before="20" w:line="240" w:lineRule="auto"/>
+            </w:pPr>
+            <w:r>
+              <w:rPr>
+                <w:b w:val="0"/>
+                <w:sz w:val="20"/>
+              </w:rPr>
+              <w:t>pytest</w:t>
+            </w:r>
+          </w:p>
+        </w:tc>
+        <w:tc>
+          <w:tcPr>
+            <w:tcW w:type="dxa" w:w="5046"/>
+            <w:vAlign w:val="center"/>
+            <w:shd w:fill="F5F7FA"/>
+            <w:tcMar>
+              <w:top w:w="60" w:type="dxa"/>
+              <w:left w:w="90" w:type="dxa"/>
+              <w:bottom w:w="60" w:type="dxa"/>
+              <w:right w:w="90" w:type="dxa"/>
+            </w:tcMar>
+          </w:tcPr>
+          <w:p>
+            <w:pPr>
+              <w:spacing w:after="20" w:before="20" w:line="240" w:lineRule="auto"/>
+            </w:pPr>
+            <w:r>
+              <w:rPr>
+                <w:b w:val="0"/>
+                <w:sz w:val="20"/>
+              </w:rPr>
+              <w:t>134 passed, 1 предупреждение Starlette/httpx</w:t>
+            </w:r>
+          </w:p>
+        </w:tc>
+      </w:tr>
+      <w:tr>
+        <w:trPr>
+          <w:cantSplit/>
+        </w:trPr>
+        <w:tc>
+          <w:tcPr>
+            <w:tcW w:type="dxa" w:w="4195"/>
+            <w:vAlign w:val="center"/>
+            <w:shd w:fill="FFFFFF"/>
+            <w:tcMar>
+              <w:top w:w="60" w:type="dxa"/>
+              <w:left w:w="90" w:type="dxa"/>
+              <w:bottom w:w="60" w:type="dxa"/>
+              <w:right w:w="90" w:type="dxa"/>
+            </w:tcMar>
+          </w:tcPr>
+          <w:p>
+            <w:pPr>
+              <w:spacing w:after="20" w:before="20" w:line="240" w:lineRule="auto"/>
+            </w:pPr>
+            <w:r>
+              <w:rPr>
+                <w:b w:val="0"/>
+                <w:sz w:val="20"/>
+              </w:rPr>
+              <w:t>Ruff</w:t>
+            </w:r>
+          </w:p>
+        </w:tc>
+        <w:tc>
+          <w:tcPr>
+            <w:tcW w:type="dxa" w:w="5046"/>
+            <w:vAlign w:val="center"/>
+            <w:shd w:fill="FFFFFF"/>
+            <w:tcMar>
+              <w:top w:w="60" w:type="dxa"/>
+              <w:left w:w="90" w:type="dxa"/>
+              <w:bottom w:w="60" w:type="dxa"/>
+              <w:right w:w="90" w:type="dxa"/>
+            </w:tcMar>
+          </w:tcPr>
+          <w:p>
+            <w:pPr>
+              <w:spacing w:after="20" w:before="20" w:line="240" w:lineRule="auto"/>
+            </w:pPr>
+            <w:r>
+              <w:rPr>
+                <w:b w:val="0"/>
+                <w:sz w:val="20"/>
+              </w:rPr>
+              <w:t>check и format --check: пройдены</w:t>
+            </w:r>
+          </w:p>
+        </w:tc>
+      </w:tr>
+      <w:tr>
+        <w:trPr>
+          <w:cantSplit/>
+        </w:trPr>
+        <w:tc>
+          <w:tcPr>
+            <w:tcW w:type="dxa" w:w="4195"/>
+            <w:vAlign w:val="center"/>
+            <w:shd w:fill="F5F7FA"/>
+            <w:tcMar>
+              <w:top w:w="60" w:type="dxa"/>
+              <w:left w:w="90" w:type="dxa"/>
+              <w:bottom w:w="60" w:type="dxa"/>
+              <w:right w:w="90" w:type="dxa"/>
+            </w:tcMar>
+          </w:tcPr>
+          <w:p>
+            <w:pPr>
+              <w:spacing w:after="20" w:before="20" w:line="240" w:lineRule="auto"/>
+            </w:pPr>
+            <w:r>
+              <w:rPr>
+                <w:b w:val="0"/>
+                <w:sz w:val="20"/>
+              </w:rPr>
+              <w:t>Pydantic codegen</w:t>
+            </w:r>
+          </w:p>
+        </w:tc>
+        <w:tc>
+          <w:tcPr>
+            <w:tcW w:type="dxa" w:w="5046"/>
+            <w:vAlign w:val="center"/>
+            <w:shd w:fill="F5F7FA"/>
+            <w:tcMar>
+              <w:top w:w="60" w:type="dxa"/>
+              <w:left w:w="90" w:type="dxa"/>
+              <w:bottom w:w="60" w:type="dxa"/>
+              <w:right w:w="90" w:type="dxa"/>
+            </w:tcMar>
+          </w:tcPr>
+          <w:p>
+            <w:pPr>
+              <w:spacing w:after="20" w:before="20" w:line="240" w:lineRule="auto"/>
+            </w:pPr>
+            <w:r>
+              <w:rPr>
+                <w:b w:val="0"/>
+                <w:sz w:val="20"/>
+              </w:rPr>
+              <w:t>scripts/generate_schemas.py --check: пройден</w:t>
+            </w:r>
+          </w:p>
+        </w:tc>
+      </w:tr>
+      <w:tr>
+        <w:trPr>
+          <w:cantSplit/>
+        </w:trPr>
+        <w:tc>
+          <w:tcPr>
+            <w:tcW w:type="dxa" w:w="4195"/>
+            <w:vAlign w:val="center"/>
+            <w:shd w:fill="FFFFFF"/>
+            <w:tcMar>
+              <w:top w:w="60" w:type="dxa"/>
+              <w:left w:w="90" w:type="dxa"/>
+              <w:bottom w:w="60" w:type="dxa"/>
+              <w:right w:w="90" w:type="dxa"/>
+            </w:tcMar>
+          </w:tcPr>
+          <w:p>
+            <w:pPr>
+              <w:spacing w:after="20" w:before="20" w:line="240" w:lineRule="auto"/>
+            </w:pPr>
+            <w:r>
+              <w:rPr>
+                <w:b w:val="0"/>
+                <w:sz w:val="20"/>
+              </w:rPr>
+              <w:t>Core codegen</w:t>
+            </w:r>
+          </w:p>
+        </w:tc>
+        <w:tc>
+          <w:tcPr>
+            <w:tcW w:type="dxa" w:w="5046"/>
+            <w:vAlign w:val="center"/>
+            <w:shd w:fill="FFFFFF"/>
+            <w:tcMar>
+              <w:top w:w="60" w:type="dxa"/>
+              <w:left w:w="90" w:type="dxa"/>
+              <w:bottom w:w="60" w:type="dxa"/>
+              <w:right w:w="90" w:type="dxa"/>
+            </w:tcMar>
+          </w:tcPr>
+          <w:p>
+            <w:pPr>
+              <w:spacing w:after="20" w:before="20" w:line="240" w:lineRule="auto"/>
+            </w:pPr>
+            <w:r>
+              <w:rPr>
+                <w:b w:val="0"/>
+                <w:sz w:val="20"/>
+              </w:rPr>
+              <w:t>--from-migration после Ruff совпадает с tables.py побайтно</w:t>
+            </w:r>
+          </w:p>
+        </w:tc>
+      </w:tr>
+      <w:tr>
+        <w:trPr>
+          <w:cantSplit/>
+        </w:trPr>
+        <w:tc>
+          <w:tcPr>
+            <w:tcW w:type="dxa" w:w="4195"/>
+            <w:vAlign w:val="center"/>
+            <w:shd w:fill="F5F7FA"/>
+            <w:tcMar>
+              <w:top w:w="60" w:type="dxa"/>
+              <w:left w:w="90" w:type="dxa"/>
+              <w:bottom w:w="60" w:type="dxa"/>
+              <w:right w:w="90" w:type="dxa"/>
+            </w:tcMar>
+          </w:tcPr>
+          <w:p>
+            <w:pPr>
+              <w:spacing w:after="20" w:before="20" w:line="240" w:lineRule="auto"/>
+            </w:pPr>
+            <w:r>
+              <w:rPr>
+                <w:b w:val="0"/>
+                <w:sz w:val="20"/>
+              </w:rPr>
+              <w:t>Новая сборка</w:t>
+            </w:r>
+          </w:p>
+        </w:tc>
+        <w:tc>
+          <w:tcPr>
+            <w:tcW w:type="dxa" w:w="5046"/>
+            <w:vAlign w:val="center"/>
+            <w:shd w:fill="F5F7FA"/>
+            <w:tcMar>
+              <w:top w:w="60" w:type="dxa"/>
+              <w:left w:w="90" w:type="dxa"/>
+              <w:bottom w:w="60" w:type="dxa"/>
+              <w:right w:w="90" w:type="dxa"/>
+            </w:tcMar>
+          </w:tcPr>
+          <w:p>
+            <w:pPr>
+              <w:spacing w:after="20" w:before="20" w:line="240" w:lineRule="auto"/>
+            </w:pPr>
+            <w:r>
+              <w:rPr>
+                <w:b w:val="0"/>
+                <w:sz w:val="20"/>
+              </w:rPr>
+              <w:t>game-radar:core-refactor, Docker 29.2.1</w:t>
+            </w:r>
+          </w:p>
+        </w:tc>
+      </w:tr>
+      <w:tr>
+        <w:trPr>
+          <w:cantSplit/>
+        </w:trPr>
+        <w:tc>
+          <w:tcPr>
+            <w:tcW w:type="dxa" w:w="4195"/>
+            <w:vAlign w:val="center"/>
+            <w:shd w:fill="FFFFFF"/>
+            <w:tcMar>
+              <w:top w:w="60" w:type="dxa"/>
+              <w:left w:w="90" w:type="dxa"/>
+              <w:bottom w:w="60" w:type="dxa"/>
+              <w:right w:w="90" w:type="dxa"/>
+            </w:tcMar>
+          </w:tcPr>
+          <w:p>
+            <w:pPr>
+              <w:spacing w:after="20" w:before="20" w:line="240" w:lineRule="auto"/>
+            </w:pPr>
+            <w:r>
+              <w:rPr>
+                <w:b w:val="0"/>
+                <w:sz w:val="20"/>
+              </w:rPr>
+              <w:t>PostgreSQL</w:t>
+            </w:r>
+          </w:p>
+        </w:tc>
+        <w:tc>
+          <w:tcPr>
+            <w:tcW w:type="dxa" w:w="5046"/>
+            <w:vAlign w:val="center"/>
+            <w:shd w:fill="FFFFFF"/>
+            <w:tcMar>
+              <w:top w:w="60" w:type="dxa"/>
+              <w:left w:w="90" w:type="dxa"/>
+              <w:bottom w:w="60" w:type="dxa"/>
+              <w:right w:w="90" w:type="dxa"/>
+            </w:tcMar>
+          </w:tcPr>
+          <w:p>
+            <w:pPr>
+              <w:spacing w:after="20" w:before="20" w:line="240" w:lineRule="auto"/>
+            </w:pPr>
+            <w:r>
+              <w:rPr>
+                <w:b w:val="0"/>
+                <w:sz w:val="20"/>
+              </w:rPr>
+              <w:t>alembic check: новых операций нет</w:t>
+            </w:r>
+          </w:p>
+        </w:tc>
+      </w:tr>
+      <w:tr>
+        <w:trPr>
+          <w:cantSplit/>
+        </w:trPr>
+        <w:tc>
+          <w:tcPr>
+            <w:tcW w:type="dxa" w:w="4195"/>
+            <w:vAlign w:val="center"/>
+            <w:shd w:fill="F5F7FA"/>
+            <w:tcMar>
+              <w:top w:w="60" w:type="dxa"/>
+              <w:left w:w="90" w:type="dxa"/>
+              <w:bottom w:w="60" w:type="dxa"/>
+              <w:right w:w="90" w:type="dxa"/>
+            </w:tcMar>
+          </w:tcPr>
+          <w:p>
+            <w:pPr>
+              <w:spacing w:after="20" w:before="20" w:line="240" w:lineRule="auto"/>
+            </w:pPr>
+            <w:r>
+              <w:rPr>
+                <w:b w:val="0"/>
+                <w:sz w:val="20"/>
+              </w:rPr>
+              <w:t>API и worker</w:t>
+            </w:r>
+          </w:p>
+        </w:tc>
+        <w:tc>
+          <w:tcPr>
+            <w:tcW w:type="dxa" w:w="5046"/>
+            <w:vAlign w:val="center"/>
+            <w:shd w:fill="F5F7FA"/>
+            <w:tcMar>
+              <w:top w:w="60" w:type="dxa"/>
+              <w:left w:w="90" w:type="dxa"/>
+              <w:bottom w:w="60" w:type="dxa"/>
+              <w:right w:w="90" w:type="dxa"/>
+            </w:tcMar>
+          </w:tcPr>
+          <w:p>
+            <w:pPr>
+              <w:spacing w:after="20" w:before="20" w:line="240" w:lineRule="auto"/>
+            </w:pPr>
+            <w:r>
+              <w:rPr>
+                <w:b w:val="0"/>
+                <w:sz w:val="20"/>
+              </w:rPr>
+              <w:t>Healthchecks вместе с db и HTTP smoke пройдены</w:t>
+            </w:r>
+          </w:p>
+        </w:tc>
+      </w:tr>
+      <w:tr>
+        <w:trPr>
+          <w:cantSplit/>
+        </w:trPr>
+        <w:tc>
+          <w:tcPr>
+            <w:tcW w:type="dxa" w:w="4195"/>
+            <w:vAlign w:val="center"/>
+            <w:shd w:fill="FFFFFF"/>
+            <w:tcMar>
+              <w:top w:w="60" w:type="dxa"/>
+              <w:left w:w="90" w:type="dxa"/>
+              <w:bottom w:w="60" w:type="dxa"/>
+              <w:right w:w="90" w:type="dxa"/>
+            </w:tcMar>
+          </w:tcPr>
+          <w:p>
+            <w:pPr>
+              <w:spacing w:after="20" w:before="20" w:line="240" w:lineRule="auto"/>
+            </w:pPr>
+            <w:r>
+              <w:rPr>
+                <w:b w:val="0"/>
+                <w:sz w:val="20"/>
+              </w:rPr>
+              <w:t>Канонический health</w:t>
+            </w:r>
+          </w:p>
+        </w:tc>
+        <w:tc>
+          <w:tcPr>
+            <w:tcW w:type="dxa" w:w="5046"/>
+            <w:vAlign w:val="center"/>
+            <w:shd w:fill="FFFFFF"/>
+            <w:tcMar>
+              <w:top w:w="60" w:type="dxa"/>
+              <w:left w:w="90" w:type="dxa"/>
+              <w:bottom w:w="60" w:type="dxa"/>
+              <w:right w:w="90" w:type="dxa"/>
+            </w:tcMar>
+          </w:tcPr>
+          <w:p>
+            <w:pPr>
+              <w:spacing w:after="20" w:before="20" w:line="240" w:lineRule="auto"/>
+            </w:pPr>
+            <w:r>
+              <w:rPr>
+                <w:b w:val="0"/>
+                <w:sz w:val="20"/>
+              </w:rPr>
+              <w:t>priceSource=mock, camelCase JSON</w:t>
+            </w:r>
+          </w:p>
+        </w:tc>
+      </w:tr>
+      <w:tr>
+        <w:trPr>
+          <w:cantSplit/>
+        </w:trPr>
+        <w:tc>
+          <w:tcPr>
+            <w:tcW w:type="dxa" w:w="4195"/>
+            <w:vAlign w:val="center"/>
+            <w:shd w:fill="F5F7FA"/>
+            <w:tcMar>
+              <w:top w:w="60" w:type="dxa"/>
+              <w:left w:w="90" w:type="dxa"/>
+              <w:bottom w:w="60" w:type="dxa"/>
+              <w:right w:w="90" w:type="dxa"/>
+            </w:tcMar>
+          </w:tcPr>
+          <w:p>
+            <w:pPr>
+              <w:spacing w:after="20" w:before="20" w:line="240" w:lineRule="auto"/>
+            </w:pPr>
+            <w:r>
+              <w:rPr>
+                <w:b w:val="0"/>
+                <w:sz w:val="20"/>
+              </w:rPr>
+              <w:t>20 конкурентных холодных чтений</w:t>
+            </w:r>
+          </w:p>
+        </w:tc>
+        <w:tc>
+          <w:tcPr>
+            <w:tcW w:type="dxa" w:w="5046"/>
+            <w:vAlign w:val="center"/>
+            <w:shd w:fill="F5F7FA"/>
+            <w:tcMar>
+              <w:top w:w="60" w:type="dxa"/>
+              <w:left w:w="90" w:type="dxa"/>
+              <w:bottom w:w="60" w:type="dxa"/>
+              <w:right w:w="90" w:type="dxa"/>
+            </w:tcMar>
+          </w:tcPr>
+          <w:p>
+            <w:pPr>
+              <w:spacing w:after="20" w:before="20" w:line="240" w:lineRule="auto"/>
+            </w:pPr>
+            <w:r>
+              <w:rPr>
+                <w:b w:val="0"/>
+                <w:sz w:val="20"/>
+              </w:rPr>
+              <w:t>1 вызов провайдера, 2 снимка цен</w:t>
+            </w:r>
+          </w:p>
+        </w:tc>
+      </w:tr>
+      <w:tr>
+        <w:trPr>
+          <w:cantSplit/>
+        </w:trPr>
+        <w:tc>
+          <w:tcPr>
+            <w:tcW w:type="dxa" w:w="4195"/>
+            <w:vAlign w:val="center"/>
+            <w:shd w:fill="FFFFFF"/>
+            <w:tcMar>
+              <w:top w:w="60" w:type="dxa"/>
+              <w:left w:w="90" w:type="dxa"/>
+              <w:bottom w:w="60" w:type="dxa"/>
+              <w:right w:w="90" w:type="dxa"/>
+            </w:tcMar>
+          </w:tcPr>
+          <w:p>
+            <w:pPr>
+              <w:spacing w:after="20" w:before="20" w:line="240" w:lineRule="auto"/>
+            </w:pPr>
+            <w:r>
+              <w:rPr>
+                <w:b w:val="0"/>
+                <w:sz w:val="20"/>
+              </w:rPr>
+              <w:t>20 добавлений одной игры</w:t>
+            </w:r>
+          </w:p>
+        </w:tc>
+        <w:tc>
+          <w:tcPr>
+            <w:tcW w:type="dxa" w:w="5046"/>
+            <w:vAlign w:val="center"/>
+            <w:shd w:fill="FFFFFF"/>
+            <w:tcMar>
+              <w:top w:w="60" w:type="dxa"/>
+              <w:left w:w="90" w:type="dxa"/>
+              <w:bottom w:w="60" w:type="dxa"/>
+              <w:right w:w="90" w:type="dxa"/>
+            </w:tcMar>
+          </w:tcPr>
+          <w:p>
+            <w:pPr>
+              <w:spacing w:after="20" w:before="20" w:line="240" w:lineRule="auto"/>
+            </w:pPr>
+            <w:r>
+              <w:rPr>
+                <w:b w:val="0"/>
+                <w:sz w:val="20"/>
+              </w:rPr>
+              <w:t>1 успех, 19 конфликтов; 1 элемент и 1 событие</w:t>
+            </w:r>
+          </w:p>
+        </w:tc>
+      </w:tr>
+      <w:tr>
+        <w:trPr>
+          <w:cantSplit/>
+        </w:trPr>
+        <w:tc>
+          <w:tcPr>
+            <w:tcW w:type="dxa" w:w="4195"/>
+            <w:vAlign w:val="center"/>
+            <w:shd w:fill="F5F7FA"/>
+            <w:tcMar>
+              <w:top w:w="60" w:type="dxa"/>
+              <w:left w:w="90" w:type="dxa"/>
+              <w:bottom w:w="60" w:type="dxa"/>
+              <w:right w:w="90" w:type="dxa"/>
+            </w:tcMar>
+          </w:tcPr>
+          <w:p>
+            <w:pPr>
+              <w:spacing w:after="20" w:before="20" w:line="240" w:lineRule="auto"/>
+            </w:pPr>
+            <w:r>
+              <w:rPr>
+                <w:b w:val="0"/>
+                <w:sz w:val="20"/>
+              </w:rPr>
+              <w:t>20 GET/PATCH и обновление</w:t>
+            </w:r>
+          </w:p>
+        </w:tc>
+        <w:tc>
+          <w:tcPr>
+            <w:tcW w:type="dxa" w:w="5046"/>
+            <w:vAlign w:val="center"/>
+            <w:shd w:fill="F5F7FA"/>
+            <w:tcMar>
+              <w:top w:w="60" w:type="dxa"/>
+              <w:left w:w="90" w:type="dxa"/>
+              <w:bottom w:w="60" w:type="dxa"/>
+              <w:right w:w="90" w:type="dxa"/>
+            </w:tcMar>
+          </w:tcPr>
+          <w:p>
+            <w:pPr>
+              <w:spacing w:after="20" w:before="20" w:line="240" w:lineRule="auto"/>
+            </w:pPr>
+            <w:r>
+              <w:rPr>
+                <w:b w:val="0"/>
+                <w:sz w:val="20"/>
+              </w:rPr>
+              <w:t>По-прежнему 1 вызов, 2 снимка, 1 событие</w:t>
+            </w:r>
+          </w:p>
+        </w:tc>
+      </w:tr>
+      <w:tr>
+        <w:trPr>
+          <w:cantSplit/>
+        </w:trPr>
+        <w:tc>
+          <w:tcPr>
+            <w:tcW w:type="dxa" w:w="4195"/>
+            <w:vAlign w:val="center"/>
+            <w:shd w:fill="FFFFFF"/>
+            <w:tcMar>
+              <w:top w:w="60" w:type="dxa"/>
+              <w:left w:w="90" w:type="dxa"/>
+              <w:bottom w:w="60" w:type="dxa"/>
+              <w:right w:w="90" w:type="dxa"/>
+            </w:tcMar>
+          </w:tcPr>
+          <w:p>
+            <w:pPr>
+              <w:spacing w:after="20" w:before="20" w:line="240" w:lineRule="auto"/>
+            </w:pPr>
+            <w:r>
+              <w:rPr>
+                <w:b w:val="0"/>
+                <w:sz w:val="20"/>
+              </w:rPr>
+              <w:t>Rollback на PostgreSQL</w:t>
+            </w:r>
+          </w:p>
+        </w:tc>
+        <w:tc>
+          <w:tcPr>
+            <w:tcW w:type="dxa" w:w="5046"/>
+            <w:vAlign w:val="center"/>
+            <w:shd w:fill="FFFFFF"/>
+            <w:tcMar>
+              <w:top w:w="60" w:type="dxa"/>
+              <w:left w:w="90" w:type="dxa"/>
+              <w:bottom w:w="60" w:type="dxa"/>
+              <w:right w:w="90" w:type="dxa"/>
+            </w:tcMar>
+          </w:tcPr>
+          <w:p>
+            <w:pPr>
+              <w:spacing w:after="20" w:before="20" w:line="240" w:lineRule="auto"/>
+            </w:pPr>
+            <w:r>
+              <w:rPr>
+                <w:b w:val="0"/>
+                <w:sz w:val="20"/>
+              </w:rPr>
+              <w:t>6 таблиц: прямой rollback и сбой Handler после INSERT сохраняют исходные данные</w:t>
+            </w:r>
+          </w:p>
+        </w:tc>
+      </w:tr>
+      <w:tr>
+        <w:trPr>
+          <w:cantSplit/>
+        </w:trPr>
+        <w:tc>
+          <w:tcPr>
+            <w:tcW w:type="dxa" w:w="4195"/>
+            <w:vAlign w:val="center"/>
+            <w:shd w:fill="F5F7FA"/>
+            <w:tcMar>
+              <w:top w:w="60" w:type="dxa"/>
+              <w:left w:w="90" w:type="dxa"/>
+              <w:bottom w:w="60" w:type="dxa"/>
+              <w:right w:w="90" w:type="dxa"/>
+            </w:tcMar>
+          </w:tcPr>
+          <w:p>
+            <w:pPr>
+              <w:spacing w:after="20" w:before="20" w:line="240" w:lineRule="auto"/>
+            </w:pPr>
+            <w:r>
+              <w:rPr>
+                <w:b w:val="0"/>
+                <w:sz w:val="20"/>
+              </w:rPr>
+              <w:t>Пересечение refresh/delete</w:t>
+            </w:r>
+          </w:p>
+        </w:tc>
+        <w:tc>
+          <w:tcPr>
+            <w:tcW w:type="dxa" w:w="5046"/>
+            <w:vAlign w:val="center"/>
+            <w:shd w:fill="F5F7FA"/>
+            <w:tcMar>
+              <w:top w:w="60" w:type="dxa"/>
+              <w:left w:w="90" w:type="dxa"/>
+              <w:bottom w:w="60" w:type="dxa"/>
+              <w:right w:w="90" w:type="dxa"/>
+            </w:tcMar>
+          </w:tcPr>
+          <w:p>
+            <w:pPr>
+              <w:spacing w:after="20" w:before="20" w:line="240" w:lineRule="auto"/>
+            </w:pPr>
+            <w:r>
+              <w:rPr>
+                <w:b w:val="0"/>
+                <w:sz w:val="20"/>
+              </w:rPr>
+              <w:t>Родитель защищён, DELETE ждёт; оба Handler успешны, deadlock=false</w:t>
+            </w:r>
+          </w:p>
+        </w:tc>
+      </w:tr>
+      <w:tr>
+        <w:trPr>
+          <w:cantSplit/>
+        </w:trPr>
+        <w:tc>
+          <w:tcPr>
+            <w:tcW w:type="dxa" w:w="4195"/>
+            <w:vAlign w:val="center"/>
+            <w:shd w:fill="FFFFFF"/>
+            <w:tcMar>
+              <w:top w:w="60" w:type="dxa"/>
+              <w:left w:w="90" w:type="dxa"/>
+              <w:bottom w:w="60" w:type="dxa"/>
+              <w:right w:w="90" w:type="dxa"/>
+            </w:tcMar>
+          </w:tcPr>
+          <w:p>
+            <w:pPr>
+              <w:spacing w:after="20" w:before="20" w:line="240" w:lineRule="auto"/>
+            </w:pPr>
+            <w:r>
+              <w:rPr>
+                <w:b w:val="0"/>
+                <w:sz w:val="20"/>
+              </w:rPr>
+              <w:t>HTTP сценарий</w:t>
+            </w:r>
+          </w:p>
+        </w:tc>
+        <w:tc>
+          <w:tcPr>
+            <w:tcW w:type="dxa" w:w="5046"/>
+            <w:vAlign w:val="center"/>
+            <w:shd w:fill="FFFFFF"/>
+            <w:tcMar>
+              <w:top w:w="60" w:type="dxa"/>
+              <w:left w:w="90" w:type="dxa"/>
+              <w:bottom w:w="60" w:type="dxa"/>
+              <w:right w:w="90" w:type="dxa"/>
+            </w:tcMar>
+          </w:tcPr>
+          <w:p>
+            <w:pPr>
+              <w:spacing w:after="20" w:before="20" w:line="240" w:lineRule="auto"/>
+            </w:pPr>
+            <w:r>
+              <w:rPr>
+                <w:b w:val="0"/>
+                <w:sz w:val="20"/>
+              </w:rPr>
+              <w:t>200/201, ошибки 401/409/422, DELETE 204</w:t>
+            </w:r>
+          </w:p>
+        </w:tc>
+      </w:tr>
+      <w:tr>
+        <w:trPr>
+          <w:cantSplit/>
+        </w:trPr>
+        <w:tc>
+          <w:tcPr>
+            <w:tcW w:type="dxa" w:w="4195"/>
+            <w:vAlign w:val="center"/>
+            <w:shd w:fill="F5F7FA"/>
+            <w:tcMar>
+              <w:top w:w="60" w:type="dxa"/>
+              <w:left w:w="90" w:type="dxa"/>
+              <w:bottom w:w="60" w:type="dxa"/>
+              <w:right w:w="90" w:type="dxa"/>
+            </w:tcMar>
+          </w:tcPr>
+          <w:p>
+            <w:pPr>
+              <w:spacing w:after="20" w:before="20" w:line="240" w:lineRule="auto"/>
+            </w:pPr>
+            <w:r>
+              <w:rPr>
+                <w:b w:val="0"/>
+                <w:sz w:val="20"/>
+              </w:rPr>
+              <w:t>Очистка fixtures</w:t>
+            </w:r>
+          </w:p>
+        </w:tc>
+        <w:tc>
+          <w:tcPr>
+            <w:tcW w:type="dxa" w:w="5046"/>
+            <w:vAlign w:val="center"/>
+            <w:shd w:fill="F5F7FA"/>
+            <w:tcMar>
+              <w:top w:w="60" w:type="dxa"/>
+              <w:left w:w="90" w:type="dxa"/>
+              <w:bottom w:w="60" w:type="dxa"/>
+              <w:right w:w="90" w:type="dxa"/>
+            </w:tcMar>
+          </w:tcPr>
+          <w:p>
+            <w:pPr>
+              <w:spacing w:after="20" w:before="20" w:line="240" w:lineRule="auto"/>
+            </w:pPr>
+            <w:r>
+              <w:rPr>
+                <w:b w:val="0"/>
+                <w:sz w:val="20"/>
+              </w:rPr>
+              <w:t>0 своих synthetic игр и списков; прежний wishlist сохранён</w:t>
+            </w:r>
+          </w:p>
+        </w:tc>
+      </w:tr>
+      <w:tr>
+        <w:trPr>
+          <w:cantSplit/>
+        </w:trPr>
+        <w:tc>
+          <w:tcPr>
+            <w:tcW w:type="dxa" w:w="4195"/>
+            <w:vAlign w:val="center"/>
+            <w:shd w:fill="FFFFFF"/>
+            <w:tcMar>
+              <w:top w:w="60" w:type="dxa"/>
+              <w:left w:w="90" w:type="dxa"/>
+              <w:bottom w:w="60" w:type="dxa"/>
+              <w:right w:w="90" w:type="dxa"/>
+            </w:tcMar>
+          </w:tcPr>
+          <w:p>
+            <w:pPr>
+              <w:spacing w:after="20" w:before="20" w:line="240" w:lineRule="auto"/>
+            </w:pPr>
+            <w:r>
+              <w:rPr>
+                <w:b w:val="0"/>
+                <w:sz w:val="20"/>
+              </w:rPr>
+              <w:t>Trivy 0.75.0 новой сборки</w:t>
+            </w:r>
+          </w:p>
+        </w:tc>
+        <w:tc>
+          <w:tcPr>
+            <w:tcW w:type="dxa" w:w="5046"/>
+            <w:vAlign w:val="center"/>
+            <w:shd w:fill="FFFFFF"/>
+            <w:tcMar>
+              <w:top w:w="60" w:type="dxa"/>
+              <w:left w:w="90" w:type="dxa"/>
+              <w:bottom w:w="60" w:type="dxa"/>
+              <w:right w:w="90" w:type="dxa"/>
+            </w:tcMar>
+          </w:tcPr>
+          <w:p>
+            <w:pPr>
+              <w:spacing w:after="20" w:before="20" w:line="240" w:lineRule="auto"/>
+            </w:pPr>
+            <w:r>
+              <w:rPr>
+                <w:b w:val="0"/>
+                <w:sz w:val="20"/>
+              </w:rPr>
+              <w:t>Debian 13.7: 0 CRITICAL, 0 secret findings, gate exit 0</w:t>
+            </w:r>
+          </w:p>
+        </w:tc>
+      </w:tr>
+    </w:tbl>
+    <w:p>
+      <w:pPr>
+        <w:spacing w:after="60" w:before="0" w:line="20" w:lineRule="exact"/>
+      </w:pPr>
+      <w:r>
+        <w:rPr>
+          <w:b w:val="0"/>
+        </w:rPr>
+      </w:r>
+      <w:r>
+        <w:rPr>
+          <w:sz w:val="2"/>
+        </w:rPr>
+      </w:r>
+    </w:p>
+    <w:p>
+      <w:r>
+        <w:rPr>
+          <w:b w:val="0"/>
+        </w:rPr>
+        <w:t>Детерминированная PostgreSQL-проверка сначала обнаружила deadlock SQLSTATE 40P01. Исправление устанавливает порядок игра → родительские wishlist (FOR KEY SHARE) → элементы (FOR UPDATE). Повторная проверка подтвердила блокировку DELETE до освобождения родителя, успешное завершение обоих Handler и отсутствие deadlock; временные записи очищены. Это фактическая проверка на PostgreSQL, которую SQLite-тесты не заменяют.</w:t>
+      </w:r>
+    </w:p>
+    <w:p>
+      <w:r>
+        <w:rPr>
+          <w:b w:val="0"/>
+        </w:rPr>
+        <w:t>Воспроизводимые проверки находятся в scripts/verify_postgres.py и scripts/verify_pg_delete_race.py. Они используют mock, временные собственные записи и production-зависимости; исходные пользовательские данные не удаляют. Конфигурация учебного Jenkins на двух хостах пока не запускалась.</w:t>
+      </w:r>
+    </w:p>
+    <w:p>
+      <w:r>
+        <w:rPr>
+          <w:b w:val="0"/>
+        </w:rPr>
+        <w:t>После проверки рабочие и нагрузочные сервисы остановлены. Постоянные тома основного проекта сохранены, временные тома нагрузки удалены.</w:t>
+      </w:r>
+    </w:p>
+    <w:tbl>
+      <w:tblPr>
+        <w:tblW w:type="auto" w:w="0"/>
+        <w:jc w:val="center"/>
+        <w:tblLayout w:type="fixed"/>
+        <w:tblLook w:firstColumn="1" w:firstRow="1" w:lastColumn="0" w:lastRow="0" w:noHBand="0" w:noVBand="1" w:val="04A0"/>
+        <w:tblBorders>
+          <w:top w:val="single" w:sz="6" w:color="D9D9D9"/>
+          <w:left w:val="single" w:sz="6" w:color="D9D9D9"/>
+          <w:bottom w:val="single" w:sz="6" w:color="D9D9D9"/>
+          <w:right w:val="single" w:sz="6" w:color="D9D9D9"/>
+          <w:insideH w:val="single" w:sz="6" w:color="D9D9D9"/>
+          <w:insideV w:val="single" w:sz="6" w:color="D9D9D9"/>
+        </w:tblBorders>
+      </w:tblPr>
+      <w:tblGrid>
+        <w:gridCol w:w="2835"/>
+        <w:gridCol w:w="6406"/>
+      </w:tblGrid>
+      <w:tr>
+        <w:trPr>
+          <w:cantSplit/>
+          <w:tblHeader/>
+        </w:trPr>
+        <w:tc>
+          <w:tcPr>
+            <w:tcW w:type="dxa" w:w="2835"/>
+            <w:vAlign w:val="center"/>
+            <w:shd w:fill="DFE8F3"/>
+            <w:tcMar>
+              <w:top w:w="60" w:type="dxa"/>
+              <w:left w:w="90" w:type="dxa"/>
+              <w:bottom w:w="60" w:type="dxa"/>
+              <w:right w:w="90" w:type="dxa"/>
+            </w:tcMar>
+          </w:tcPr>
+          <w:p>
+            <w:pPr>
+              <w:keepNext/>
+              <w:spacing w:after="20" w:before="20" w:line="240" w:lineRule="auto"/>
+            </w:pPr>
+            <w:r>
+              <w:rPr>
+                <w:b/>
+                <w:sz w:val="20"/>
+              </w:rPr>
+              <w:t>Артефакт 7 октября</w:t>
+            </w:r>
+          </w:p>
+        </w:tc>
+        <w:tc>
+          <w:tcPr>
+            <w:tcW w:type="dxa" w:w="6406"/>
+            <w:vAlign w:val="center"/>
+            <w:shd w:fill="DFE8F3"/>
+            <w:tcMar>
+              <w:top w:w="60" w:type="dxa"/>
+              <w:left w:w="90" w:type="dxa"/>
+              <w:bottom w:w="60" w:type="dxa"/>
+              <w:right w:w="90" w:type="dxa"/>
+            </w:tcMar>
+          </w:tcPr>
+          <w:p>
+            <w:pPr>
+              <w:keepNext/>
+              <w:spacing w:after="20" w:before="20" w:line="240" w:lineRule="auto"/>
+            </w:pPr>
+            <w:r>
+              <w:rPr>
+                <w:b/>
+                <w:sz w:val="20"/>
+              </w:rPr>
+              <w:t>Расположение</w:t>
+            </w:r>
+          </w:p>
+        </w:tc>
+      </w:tr>
+      <w:tr>
+        <w:trPr>
+          <w:cantSplit/>
+        </w:trPr>
+        <w:tc>
+          <w:tcPr>
+            <w:tcW w:type="dxa" w:w="2835"/>
+            <w:vAlign w:val="center"/>
+            <w:shd w:fill="FFFFFF"/>
+            <w:tcMar>
+              <w:top w:w="60" w:type="dxa"/>
+              <w:left w:w="90" w:type="dxa"/>
+              <w:bottom w:w="60" w:type="dxa"/>
+              <w:right w:w="90" w:type="dxa"/>
+            </w:tcMar>
+          </w:tcPr>
+          <w:p>
+            <w:pPr>
+              <w:keepNext/>
+              <w:spacing w:after="20" w:before="20" w:line="240" w:lineRule="auto"/>
+            </w:pPr>
+            <w:r>
+              <w:rPr>
+                <w:b w:val="0"/>
+                <w:sz w:val="20"/>
+              </w:rPr>
+              <w:t>Trivy новой сборки</w:t>
+            </w:r>
+          </w:p>
+        </w:tc>
+        <w:tc>
+          <w:tcPr>
+            <w:tcW w:type="dxa" w:w="6406"/>
+            <w:vAlign w:val="center"/>
+            <w:shd w:fill="FFFFFF"/>
+            <w:tcMar>
+              <w:top w:w="60" w:type="dxa"/>
+              <w:left w:w="90" w:type="dxa"/>
+              <w:bottom w:w="60" w:type="dxa"/>
+              <w:right w:w="90" w:type="dxa"/>
+            </w:tcMar>
+          </w:tcPr>
+          <w:p>
+            <w:pPr>
+              <w:keepNext/>
+              <w:spacing w:after="20" w:before="20" w:line="240" w:lineRule="auto"/>
+            </w:pPr>
+            <w:r>
+              <w:rPr>
+                <w:b w:val="0"/>
+                <w:sz w:val="20"/>
+              </w:rPr>
+              <w:t>.local/reports/trivy-core-refactor.json</w:t>
+            </w:r>
+          </w:p>
+        </w:tc>
+      </w:tr>
+      <w:tr>
+        <w:trPr>
+          <w:cantSplit/>
+        </w:trPr>
+        <w:tc>
+          <w:tcPr>
+            <w:tcW w:type="dxa" w:w="2835"/>
+            <w:vAlign w:val="center"/>
+            <w:shd w:fill="F5F7FA"/>
+            <w:tcMar>
+              <w:top w:w="60" w:type="dxa"/>
+              <w:left w:w="90" w:type="dxa"/>
+              <w:bottom w:w="60" w:type="dxa"/>
+              <w:right w:w="90" w:type="dxa"/>
+            </w:tcMar>
+          </w:tcPr>
+          <w:p>
+            <w:pPr>
+              <w:keepNext/>
+              <w:spacing w:after="20" w:before="20" w:line="240" w:lineRule="auto"/>
+            </w:pPr>
+            <w:r>
+              <w:rPr>
+                <w:b w:val="0"/>
+                <w:sz w:val="20"/>
+              </w:rPr>
+              <w:t>Итоговая сводка JMeter</w:t>
+            </w:r>
+          </w:p>
+        </w:tc>
+        <w:tc>
+          <w:tcPr>
+            <w:tcW w:type="dxa" w:w="6406"/>
+            <w:vAlign w:val="center"/>
+            <w:shd w:fill="F5F7FA"/>
+            <w:tcMar>
+              <w:top w:w="60" w:type="dxa"/>
+              <w:left w:w="90" w:type="dxa"/>
+              <w:bottom w:w="60" w:type="dxa"/>
+              <w:right w:w="90" w:type="dxa"/>
+            </w:tcMar>
+          </w:tcPr>
+          <w:p>
+            <w:pPr>
+              <w:keepNext/>
+              <w:spacing w:after="20" w:before="20" w:line="240" w:lineRule="auto"/>
+            </w:pPr>
+            <w:r>
+              <w:rPr>
+                <w:b w:val="0"/>
+                <w:sz w:val="20"/>
+              </w:rPr>
+              <w:t>.local/reports/load-core-refactor-final-summary.json</w:t>
+            </w:r>
+          </w:p>
+        </w:tc>
+      </w:tr>
+      <w:tr>
+        <w:trPr>
+          <w:cantSplit/>
+        </w:trPr>
+        <w:tc>
+          <w:tcPr>
+            <w:tcW w:type="dxa" w:w="2835"/>
+            <w:vAlign w:val="center"/>
+            <w:shd w:fill="FFFFFF"/>
+            <w:tcMar>
+              <w:top w:w="60" w:type="dxa"/>
+              <w:left w:w="90" w:type="dxa"/>
+              <w:bottom w:w="60" w:type="dxa"/>
+              <w:right w:w="90" w:type="dxa"/>
+            </w:tcMar>
+          </w:tcPr>
+          <w:p>
+            <w:pPr>
+              <w:keepNext/>
+              <w:spacing w:after="20" w:before="20" w:line="240" w:lineRule="auto"/>
+            </w:pPr>
+            <w:r>
+              <w:rPr>
+                <w:b w:val="0"/>
+                <w:sz w:val="20"/>
+              </w:rPr>
+              <w:t>Итоговый JTL</w:t>
+            </w:r>
+          </w:p>
+        </w:tc>
+        <w:tc>
+          <w:tcPr>
+            <w:tcW w:type="dxa" w:w="6406"/>
+            <w:vAlign w:val="center"/>
+            <w:shd w:fill="FFFFFF"/>
+            <w:tcMar>
+              <w:top w:w="60" w:type="dxa"/>
+              <w:left w:w="90" w:type="dxa"/>
+              <w:bottom w:w="60" w:type="dxa"/>
+              <w:right w:w="90" w:type="dxa"/>
+            </w:tcMar>
+          </w:tcPr>
+          <w:p>
+            <w:pPr>
+              <w:keepNext/>
+              <w:spacing w:after="20" w:before="20" w:line="240" w:lineRule="auto"/>
+            </w:pPr>
+            <w:r>
+              <w:rPr>
+                <w:b w:val="0"/>
+                <w:sz w:val="20"/>
+              </w:rPr>
+              <w:t>load-tests/results/core-refactor-final/results.jtl</w:t>
+            </w:r>
+          </w:p>
+        </w:tc>
+      </w:tr>
+      <w:tr>
+        <w:trPr>
+          <w:cantSplit/>
+        </w:trPr>
+        <w:tc>
+          <w:tcPr>
+            <w:tcW w:type="dxa" w:w="2835"/>
+            <w:vAlign w:val="center"/>
+            <w:shd w:fill="F5F7FA"/>
+            <w:tcMar>
+              <w:top w:w="60" w:type="dxa"/>
+              <w:left w:w="90" w:type="dxa"/>
+              <w:bottom w:w="60" w:type="dxa"/>
+              <w:right w:w="90" w:type="dxa"/>
+            </w:tcMar>
+          </w:tcPr>
+          <w:p>
+            <w:pPr>
+              <w:keepNext w:val="0"/>
+              <w:spacing w:after="20" w:before="20" w:line="240" w:lineRule="auto"/>
+            </w:pPr>
+            <w:r>
+              <w:rPr>
+                <w:b w:val="0"/>
+                <w:sz w:val="20"/>
+              </w:rPr>
+              <w:t>Итоговый HTML JMeter</w:t>
+            </w:r>
+          </w:p>
+        </w:tc>
+        <w:tc>
+          <w:tcPr>
+            <w:tcW w:type="dxa" w:w="6406"/>
+            <w:vAlign w:val="center"/>
+            <w:shd w:fill="F5F7FA"/>
+            <w:tcMar>
+              <w:top w:w="60" w:type="dxa"/>
+              <w:left w:w="90" w:type="dxa"/>
+              <w:bottom w:w="60" w:type="dxa"/>
+              <w:right w:w="90" w:type="dxa"/>
+            </w:tcMar>
+          </w:tcPr>
+          <w:p>
+            <w:pPr>
+              <w:keepNext w:val="0"/>
+              <w:spacing w:after="20" w:before="20" w:line="240" w:lineRule="auto"/>
+            </w:pPr>
+            <w:r>
+              <w:rPr>
+                <w:b w:val="0"/>
+                <w:sz w:val="20"/>
+              </w:rPr>
+              <w:t>load-tests/results/core-refactor-final/html/index.html</w:t>
+            </w:r>
+          </w:p>
+        </w:tc>
+      </w:tr>
+    </w:tbl>
+    <w:p>
+      <w:pPr>
+        <w:spacing w:after="60" w:before="0" w:line="20" w:lineRule="exact"/>
+      </w:pPr>
+      <w:r>
+        <w:rPr>
+          <w:b w:val="0"/>
+        </w:rPr>
+      </w:r>
+      <w:r>
+        <w:rPr>
+          <w:sz w:val="2"/>
+        </w:rPr>
+      </w:r>
+    </w:p>
+    <w:p>
+      <w:pPr>
+        <w:pStyle w:val="Heading2"/>
+      </w:pPr>
+      <w:r>
+        <w:t>Исходные измерения 6 октября до рефакторинга</w:t>
+      </w:r>
+    </w:p>
+    <w:p>
+      <w:pPr>
+        <w:pStyle w:val="Heading2"/>
+      </w:pPr>
+      <w:r>
         <w:t>Автоматические и конкурентные проверки</w:t>
       </w:r>
     </w:p>
@@ -5865,7 +7720,7 @@
         <w:rPr>
           <w:b w:val="0"/>
         </w:rPr>
-        <w:t>pytest завершился результатом 59 passed. Ruff check и Ruff format успешно проверили исходники. Тесты используют отдельную SQLite в памяти, запрещают внешний HTTP и проверяют HTTP-контракт, Use Cases, Domain, провайдер через MockTransport, кэш, журнал, историю, health и JTL gate.</w:t>
+        <w:t>6 октября pytest завершился результатом 59 passed. Ruff check и Ruff format успешно проверили исходники. Тесты используют отдельную SQLite в памяти, запрещают внешний HTTP и проверяют HTTP-контракт, Use Cases, Domain, провайдер через MockTransport, кэш, журнал, историю, health и JTL gate.</w:t>
       </w:r>
     </w:p>
     <w:tbl>
@@ -6308,7 +8163,7 @@
         <w:rPr>
           <w:b w:val="0"/>
         </w:rPr>
-        <w:t>Отдельно выполнены два реальных обращения к CheapShark вне нагрузки: поиск Portal 2 и получение предложений. Получен steam_app_id=620 и одно предложение Steam. Рабочий локальный стенд продолжает использовать mock.</w:t>
+        <w:t>Отдельно выполнены два реальных обращения к CheapShark вне нагрузки: поиск Portal 2 и получение предложений. Получен steam_app_id=620 и одно предложение Steam. Это проверка интеграции 6 октября; после рефакторинга Docker-стенд выключен.</w:t>
       </w:r>
     </w:p>
     <w:p>
@@ -6333,6 +8188,14 @@
           <w:b w:val="0"/>
         </w:rPr>
         <w:t>Короткий non-GUI прогон: threads=2, steps=3, ramp=1, hold_seconds=5, duration=16, think_ms=100. Запросы новых групп начинались примерно на 0, 5 и 10 секунде, то есть предложенная нагрузка росла до 2, 4 и 6 пользователей. Timer задерживает первые HTTP-запросы; счётчик потоков JMeter также включает ожидающие группы.</w:t>
+      </w:r>
+    </w:p>
+    <w:p>
+      <w:r>
+        <w:rPr>
+          <w:b w:val="0"/>
+        </w:rPr>
+        <w:t>Повторный короткий прогон 7 октября выполнен после исправления блокировок на новой сборке с camelCase JSON и тем же профилем 16 секунд. Ниже исходная версия и итоговая Core-версия показаны отдельно; оба запуска являются локальной проверкой плана и не определяют предел производительности.</w:t>
       </w:r>
     </w:p>
     <w:tbl>
@@ -6351,8 +8214,9 @@
         </w:tblBorders>
       </w:tblPr>
       <w:tblGrid>
-        <w:gridCol w:w="5386"/>
-        <w:gridCol w:w="3855"/>
+        <w:gridCol w:w="4139"/>
+        <w:gridCol w:w="2551"/>
+        <w:gridCol w:w="2551"/>
       </w:tblGrid>
       <w:tr>
         <w:trPr>
@@ -6361,7 +8225,7 @@
         </w:trPr>
         <w:tc>
           <w:tcPr>
-            <w:tcW w:type="dxa" w:w="5386"/>
+            <w:tcW w:type="dxa" w:w="4139"/>
             <w:vAlign w:val="center"/>
             <w:shd w:fill="DFE8F3"/>
             <w:tcMar>
@@ -6380,13 +8244,13 @@
                 <w:b/>
                 <w:sz w:val="20"/>
               </w:rPr>
-              <w:t>Метрика короткой проверки</w:t>
+              <w:t>Метрика короткого прогона</w:t>
             </w:r>
           </w:p>
         </w:tc>
         <w:tc>
           <w:tcPr>
-            <w:tcW w:type="dxa" w:w="3855"/>
+            <w:tcW w:type="dxa" w:w="2551"/>
             <w:vAlign w:val="center"/>
             <w:shd w:fill="DFE8F3"/>
             <w:tcMar>
@@ -6399,14 +8263,38 @@
           <w:p>
             <w:pPr>
               <w:spacing w:after="20" w:before="20" w:line="240" w:lineRule="auto"/>
-              <w:jc w:val="center"/>
             </w:pPr>
             <w:r>
               <w:rPr>
                 <w:b/>
                 <w:sz w:val="20"/>
               </w:rPr>
-              <w:t>Значение</w:t>
+              <w:t>6 октября baseline</w:t>
+            </w:r>
+          </w:p>
+        </w:tc>
+        <w:tc>
+          <w:tcPr>
+            <w:tcW w:type="dxa" w:w="2551"/>
+            <w:vAlign w:val="center"/>
+            <w:shd w:fill="DFE8F3"/>
+            <w:tcMar>
+              <w:top w:w="60" w:type="dxa"/>
+              <w:left w:w="90" w:type="dxa"/>
+              <w:bottom w:w="60" w:type="dxa"/>
+              <w:right w:w="90" w:type="dxa"/>
+            </w:tcMar>
+          </w:tcPr>
+          <w:p>
+            <w:pPr>
+              <w:spacing w:after="20" w:before="20" w:line="240" w:lineRule="auto"/>
+            </w:pPr>
+            <w:r>
+              <w:rPr>
+                <w:b/>
+                <w:sz w:val="20"/>
+              </w:rPr>
+              <w:t>7 октября Core</w:t>
             </w:r>
           </w:p>
         </w:tc>
@@ -6417,7 +8305,7 @@
         </w:trPr>
         <w:tc>
           <w:tcPr>
-            <w:tcW w:type="dxa" w:w="5386"/>
+            <w:tcW w:type="dxa" w:w="4139"/>
             <w:vAlign w:val="center"/>
             <w:shd w:fill="FFFFFF"/>
             <w:tcMar>
@@ -6442,7 +8330,7 @@
         </w:tc>
         <w:tc>
           <w:tcPr>
-            <w:tcW w:type="dxa" w:w="3855"/>
+            <w:tcW w:type="dxa" w:w="2551"/>
             <w:vAlign w:val="center"/>
             <w:shd w:fill="FFFFFF"/>
             <w:tcMar>
@@ -6455,7 +8343,6 @@
           <w:p>
             <w:pPr>
               <w:spacing w:after="20" w:before="20" w:line="240" w:lineRule="auto"/>
-              <w:jc w:val="center"/>
             </w:pPr>
             <w:r>
               <w:rPr>
@@ -6466,6 +8353,31 @@
             </w:r>
           </w:p>
         </w:tc>
+        <w:tc>
+          <w:tcPr>
+            <w:tcW w:type="dxa" w:w="2551"/>
+            <w:vAlign w:val="center"/>
+            <w:shd w:fill="FFFFFF"/>
+            <w:tcMar>
+              <w:top w:w="60" w:type="dxa"/>
+              <w:left w:w="90" w:type="dxa"/>
+              <w:bottom w:w="60" w:type="dxa"/>
+              <w:right w:w="90" w:type="dxa"/>
+            </w:tcMar>
+          </w:tcPr>
+          <w:p>
+            <w:pPr>
+              <w:spacing w:after="20" w:before="20" w:line="240" w:lineRule="auto"/>
+            </w:pPr>
+            <w:r>
+              <w:rPr>
+                <w:b w:val="0"/>
+                <w:sz w:val="20"/>
+              </w:rPr>
+              <w:t>338</w:t>
+            </w:r>
+          </w:p>
+        </w:tc>
       </w:tr>
       <w:tr>
         <w:trPr>
@@ -6473,7 +8385,7 @@
         </w:trPr>
         <w:tc>
           <w:tcPr>
-            <w:tcW w:type="dxa" w:w="5386"/>
+            <w:tcW w:type="dxa" w:w="4139"/>
             <w:vAlign w:val="center"/>
             <w:shd w:fill="F5F7FA"/>
             <w:tcMar>
@@ -6498,7 +8410,7 @@
         </w:tc>
         <w:tc>
           <w:tcPr>
-            <w:tcW w:type="dxa" w:w="3855"/>
+            <w:tcW w:type="dxa" w:w="2551"/>
             <w:vAlign w:val="center"/>
             <w:shd w:fill="F5F7FA"/>
             <w:tcMar>
@@ -6511,14 +8423,38 @@
           <w:p>
             <w:pPr>
               <w:spacing w:after="20" w:before="20" w:line="240" w:lineRule="auto"/>
-              <w:jc w:val="center"/>
             </w:pPr>
             <w:r>
               <w:rPr>
                 <w:b w:val="0"/>
                 <w:sz w:val="20"/>
               </w:rPr>
-              <w:t>0 или 0%</w:t>
+              <w:t>0 / 0%</w:t>
+            </w:r>
+          </w:p>
+        </w:tc>
+        <w:tc>
+          <w:tcPr>
+            <w:tcW w:type="dxa" w:w="2551"/>
+            <w:vAlign w:val="center"/>
+            <w:shd w:fill="F5F7FA"/>
+            <w:tcMar>
+              <w:top w:w="60" w:type="dxa"/>
+              <w:left w:w="90" w:type="dxa"/>
+              <w:bottom w:w="60" w:type="dxa"/>
+              <w:right w:w="90" w:type="dxa"/>
+            </w:tcMar>
+          </w:tcPr>
+          <w:p>
+            <w:pPr>
+              <w:spacing w:after="20" w:before="20" w:line="240" w:lineRule="auto"/>
+            </w:pPr>
+            <w:r>
+              <w:rPr>
+                <w:b w:val="0"/>
+                <w:sz w:val="20"/>
+              </w:rPr>
+              <w:t>0 / 0%</w:t>
             </w:r>
           </w:p>
         </w:tc>
@@ -6529,7 +8465,7 @@
         </w:trPr>
         <w:tc>
           <w:tcPr>
-            <w:tcW w:type="dxa" w:w="5386"/>
+            <w:tcW w:type="dxa" w:w="4139"/>
             <w:vAlign w:val="center"/>
             <w:shd w:fill="FFFFFF"/>
             <w:tcMar>
@@ -6554,7 +8490,7 @@
         </w:tc>
         <w:tc>
           <w:tcPr>
-            <w:tcW w:type="dxa" w:w="3855"/>
+            <w:tcW w:type="dxa" w:w="2551"/>
             <w:vAlign w:val="center"/>
             <w:shd w:fill="FFFFFF"/>
             <w:tcMar>
@@ -6567,7 +8503,6 @@
           <w:p>
             <w:pPr>
               <w:spacing w:after="20" w:before="20" w:line="240" w:lineRule="auto"/>
-              <w:jc w:val="center"/>
             </w:pPr>
             <w:r>
               <w:rPr>
@@ -6578,6 +8513,31 @@
             </w:r>
           </w:p>
         </w:tc>
+        <w:tc>
+          <w:tcPr>
+            <w:tcW w:type="dxa" w:w="2551"/>
+            <w:vAlign w:val="center"/>
+            <w:shd w:fill="FFFFFF"/>
+            <w:tcMar>
+              <w:top w:w="60" w:type="dxa"/>
+              <w:left w:w="90" w:type="dxa"/>
+              <w:bottom w:w="60" w:type="dxa"/>
+              <w:right w:w="90" w:type="dxa"/>
+            </w:tcMar>
+          </w:tcPr>
+          <w:p>
+            <w:pPr>
+              <w:spacing w:after="20" w:before="20" w:line="240" w:lineRule="auto"/>
+            </w:pPr>
+            <w:r>
+              <w:rPr>
+                <w:b w:val="0"/>
+                <w:sz w:val="20"/>
+              </w:rPr>
+              <w:t>15.724 с</w:t>
+            </w:r>
+          </w:p>
+        </w:tc>
       </w:tr>
       <w:tr>
         <w:trPr>
@@ -6585,7 +8545,7 @@
         </w:trPr>
         <w:tc>
           <w:tcPr>
-            <w:tcW w:type="dxa" w:w="5386"/>
+            <w:tcW w:type="dxa" w:w="4139"/>
             <w:vAlign w:val="center"/>
             <w:shd w:fill="F5F7FA"/>
             <w:tcMar>
@@ -6604,13 +8564,13 @@
                 <w:b w:val="0"/>
                 <w:sz w:val="20"/>
               </w:rPr>
-              <w:t>Пропускная способность</w:t>
+              <w:t>Запросы в секунду</w:t>
             </w:r>
           </w:p>
         </w:tc>
         <w:tc>
           <w:tcPr>
-            <w:tcW w:type="dxa" w:w="3855"/>
+            <w:tcW w:type="dxa" w:w="2551"/>
             <w:vAlign w:val="center"/>
             <w:shd w:fill="F5F7FA"/>
             <w:tcMar>
@@ -6623,14 +8583,38 @@
           <w:p>
             <w:pPr>
               <w:spacing w:after="20" w:before="20" w:line="240" w:lineRule="auto"/>
-              <w:jc w:val="center"/>
             </w:pPr>
             <w:r>
               <w:rPr>
                 <w:b w:val="0"/>
                 <w:sz w:val="20"/>
               </w:rPr>
-              <w:t>21.207 запроса в секунду</w:t>
+              <w:t>21.207</w:t>
+            </w:r>
+          </w:p>
+        </w:tc>
+        <w:tc>
+          <w:tcPr>
+            <w:tcW w:type="dxa" w:w="2551"/>
+            <w:vAlign w:val="center"/>
+            <w:shd w:fill="F5F7FA"/>
+            <w:tcMar>
+              <w:top w:w="60" w:type="dxa"/>
+              <w:left w:w="90" w:type="dxa"/>
+              <w:bottom w:w="60" w:type="dxa"/>
+              <w:right w:w="90" w:type="dxa"/>
+            </w:tcMar>
+          </w:tcPr>
+          <w:p>
+            <w:pPr>
+              <w:spacing w:after="20" w:before="20" w:line="240" w:lineRule="auto"/>
+            </w:pPr>
+            <w:r>
+              <w:rPr>
+                <w:b w:val="0"/>
+                <w:sz w:val="20"/>
+              </w:rPr>
+              <w:t>21.496</w:t>
             </w:r>
           </w:p>
         </w:tc>
@@ -6641,7 +8625,7 @@
         </w:trPr>
         <w:tc>
           <w:tcPr>
-            <w:tcW w:type="dxa" w:w="5386"/>
+            <w:tcW w:type="dxa" w:w="4139"/>
             <w:vAlign w:val="center"/>
             <w:shd w:fill="FFFFFF"/>
             <w:tcMar>
@@ -6660,13 +8644,13 @@
                 <w:b w:val="0"/>
                 <w:sz w:val="20"/>
               </w:rPr>
-              <w:t>p90</w:t>
+              <w:t>p90, мс</w:t>
             </w:r>
           </w:p>
         </w:tc>
         <w:tc>
           <w:tcPr>
-            <w:tcW w:type="dxa" w:w="3855"/>
+            <w:tcW w:type="dxa" w:w="2551"/>
             <w:vAlign w:val="center"/>
             <w:shd w:fill="FFFFFF"/>
             <w:tcMar>
@@ -6679,14 +8663,38 @@
           <w:p>
             <w:pPr>
               <w:spacing w:after="20" w:before="20" w:line="240" w:lineRule="auto"/>
-              <w:jc w:val="center"/>
             </w:pPr>
             <w:r>
               <w:rPr>
                 <w:b w:val="0"/>
                 <w:sz w:val="20"/>
               </w:rPr>
-              <w:t>20 мс</w:t>
+              <w:t>20</w:t>
+            </w:r>
+          </w:p>
+        </w:tc>
+        <w:tc>
+          <w:tcPr>
+            <w:tcW w:type="dxa" w:w="2551"/>
+            <w:vAlign w:val="center"/>
+            <w:shd w:fill="FFFFFF"/>
+            <w:tcMar>
+              <w:top w:w="60" w:type="dxa"/>
+              <w:left w:w="90" w:type="dxa"/>
+              <w:bottom w:w="60" w:type="dxa"/>
+              <w:right w:w="90" w:type="dxa"/>
+            </w:tcMar>
+          </w:tcPr>
+          <w:p>
+            <w:pPr>
+              <w:spacing w:after="20" w:before="20" w:line="240" w:lineRule="auto"/>
+            </w:pPr>
+            <w:r>
+              <w:rPr>
+                <w:b w:val="0"/>
+                <w:sz w:val="20"/>
+              </w:rPr>
+              <w:t>24</w:t>
             </w:r>
           </w:p>
         </w:tc>
@@ -6697,7 +8705,7 @@
         </w:trPr>
         <w:tc>
           <w:tcPr>
-            <w:tcW w:type="dxa" w:w="5386"/>
+            <w:tcW w:type="dxa" w:w="4139"/>
             <w:vAlign w:val="center"/>
             <w:shd w:fill="F5F7FA"/>
             <w:tcMar>
@@ -6716,13 +8724,13 @@
                 <w:b w:val="0"/>
                 <w:sz w:val="20"/>
               </w:rPr>
-              <w:t>p95</w:t>
+              <w:t>p95, мс</w:t>
             </w:r>
           </w:p>
         </w:tc>
         <w:tc>
           <w:tcPr>
-            <w:tcW w:type="dxa" w:w="3855"/>
+            <w:tcW w:type="dxa" w:w="2551"/>
             <w:vAlign w:val="center"/>
             <w:shd w:fill="F5F7FA"/>
             <w:tcMar>
@@ -6735,14 +8743,38 @@
           <w:p>
             <w:pPr>
               <w:spacing w:after="20" w:before="20" w:line="240" w:lineRule="auto"/>
-              <w:jc w:val="center"/>
             </w:pPr>
             <w:r>
               <w:rPr>
                 <w:b w:val="0"/>
                 <w:sz w:val="20"/>
               </w:rPr>
-              <w:t>24 мс</w:t>
+              <w:t>24</w:t>
+            </w:r>
+          </w:p>
+        </w:tc>
+        <w:tc>
+          <w:tcPr>
+            <w:tcW w:type="dxa" w:w="2551"/>
+            <w:vAlign w:val="center"/>
+            <w:shd w:fill="F5F7FA"/>
+            <w:tcMar>
+              <w:top w:w="60" w:type="dxa"/>
+              <w:left w:w="90" w:type="dxa"/>
+              <w:bottom w:w="60" w:type="dxa"/>
+              <w:right w:w="90" w:type="dxa"/>
+            </w:tcMar>
+          </w:tcPr>
+          <w:p>
+            <w:pPr>
+              <w:spacing w:after="20" w:before="20" w:line="240" w:lineRule="auto"/>
+            </w:pPr>
+            <w:r>
+              <w:rPr>
+                <w:b w:val="0"/>
+                <w:sz w:val="20"/>
+              </w:rPr>
+              <w:t>26</w:t>
             </w:r>
           </w:p>
         </w:tc>
@@ -6753,7 +8785,7 @@
         </w:trPr>
         <w:tc>
           <w:tcPr>
-            <w:tcW w:type="dxa" w:w="5386"/>
+            <w:tcW w:type="dxa" w:w="4139"/>
             <w:vAlign w:val="center"/>
             <w:shd w:fill="FFFFFF"/>
             <w:tcMar>
@@ -6772,13 +8804,13 @@
                 <w:b w:val="0"/>
                 <w:sz w:val="20"/>
               </w:rPr>
-              <w:t>p99</w:t>
+              <w:t>p99, мс</w:t>
             </w:r>
           </w:p>
         </w:tc>
         <w:tc>
           <w:tcPr>
-            <w:tcW w:type="dxa" w:w="3855"/>
+            <w:tcW w:type="dxa" w:w="2551"/>
             <w:vAlign w:val="center"/>
             <w:shd w:fill="FFFFFF"/>
             <w:tcMar>
@@ -6791,14 +8823,38 @@
           <w:p>
             <w:pPr>
               <w:spacing w:after="20" w:before="20" w:line="240" w:lineRule="auto"/>
-              <w:jc w:val="center"/>
             </w:pPr>
             <w:r>
               <w:rPr>
                 <w:b w:val="0"/>
                 <w:sz w:val="20"/>
               </w:rPr>
-              <w:t>2644 мс</w:t>
+              <w:t>2644</w:t>
+            </w:r>
+          </w:p>
+        </w:tc>
+        <w:tc>
+          <w:tcPr>
+            <w:tcW w:type="dxa" w:w="2551"/>
+            <w:vAlign w:val="center"/>
+            <w:shd w:fill="FFFFFF"/>
+            <w:tcMar>
+              <w:top w:w="60" w:type="dxa"/>
+              <w:left w:w="90" w:type="dxa"/>
+              <w:bottom w:w="60" w:type="dxa"/>
+              <w:right w:w="90" w:type="dxa"/>
+            </w:tcMar>
+          </w:tcPr>
+          <w:p>
+            <w:pPr>
+              <w:spacing w:after="20" w:before="20" w:line="240" w:lineRule="auto"/>
+            </w:pPr>
+            <w:r>
+              <w:rPr>
+                <w:b w:val="0"/>
+                <w:sz w:val="20"/>
+              </w:rPr>
+              <w:t>2602</w:t>
             </w:r>
           </w:p>
         </w:tc>
@@ -6809,7 +8865,7 @@
         </w:trPr>
         <w:tc>
           <w:tcPr>
-            <w:tcW w:type="dxa" w:w="5386"/>
+            <w:tcW w:type="dxa" w:w="4139"/>
             <w:vAlign w:val="center"/>
             <w:shd w:fill="F5F7FA"/>
             <w:tcMar>
@@ -6834,7 +8890,7 @@
         </w:tc>
         <w:tc>
           <w:tcPr>
-            <w:tcW w:type="dxa" w:w="3855"/>
+            <w:tcW w:type="dxa" w:w="2551"/>
             <w:vAlign w:val="center"/>
             <w:shd w:fill="F5F7FA"/>
             <w:tcMar>
@@ -6847,7 +8903,31 @@
           <w:p>
             <w:pPr>
               <w:spacing w:after="20" w:before="20" w:line="240" w:lineRule="auto"/>
-              <w:jc w:val="center"/>
+            </w:pPr>
+            <w:r>
+              <w:rPr>
+                <w:b w:val="0"/>
+                <w:sz w:val="20"/>
+              </w:rPr>
+              <w:t>Пройден</w:t>
+            </w:r>
+          </w:p>
+        </w:tc>
+        <w:tc>
+          <w:tcPr>
+            <w:tcW w:type="dxa" w:w="2551"/>
+            <w:vAlign w:val="center"/>
+            <w:shd w:fill="F5F7FA"/>
+            <w:tcMar>
+              <w:top w:w="60" w:type="dxa"/>
+              <w:left w:w="90" w:type="dxa"/>
+              <w:bottom w:w="60" w:type="dxa"/>
+              <w:right w:w="90" w:type="dxa"/>
+            </w:tcMar>
+          </w:tcPr>
+          <w:p>
+            <w:pPr>
+              <w:spacing w:after="20" w:before="20" w:line="240" w:lineRule="auto"/>
             </w:pPr>
             <w:r>
               <w:rPr>
@@ -6891,9 +8971,11 @@
         </w:tblBorders>
       </w:tblPr>
       <w:tblGrid>
-        <w:gridCol w:w="5839"/>
-        <w:gridCol w:w="1701"/>
-        <w:gridCol w:w="1701"/>
+        <w:gridCol w:w="3572"/>
+        <w:gridCol w:w="1984"/>
+        <w:gridCol w:w="794"/>
+        <w:gridCol w:w="2098"/>
+        <w:gridCol w:w="794"/>
       </w:tblGrid>
       <w:tr>
         <w:trPr>
@@ -6902,7 +8984,7 @@
         </w:trPr>
         <w:tc>
           <w:tcPr>
-            <w:tcW w:type="dxa" w:w="5839"/>
+            <w:tcW w:type="dxa" w:w="3572"/>
             <w:vAlign w:val="center"/>
             <w:shd w:fill="DFE8F3"/>
             <w:tcMar>
@@ -6928,7 +9010,7 @@
         </w:tc>
         <w:tc>
           <w:tcPr>
-            <w:tcW w:type="dxa" w:w="1701"/>
+            <w:tcW w:type="dxa" w:w="1984"/>
             <w:vAlign w:val="center"/>
             <w:shd w:fill="DFE8F3"/>
             <w:tcMar>
@@ -6942,20 +9024,19 @@
             <w:pPr>
               <w:keepNext/>
               <w:spacing w:after="20" w:before="20" w:line="240" w:lineRule="auto"/>
-              <w:jc w:val="center"/>
             </w:pPr>
             <w:r>
               <w:rPr>
                 <w:b/>
                 <w:sz w:val="20"/>
               </w:rPr>
-              <w:t>Запросы</w:t>
+              <w:t>6 окт запросы</w:t>
             </w:r>
           </w:p>
         </w:tc>
         <w:tc>
           <w:tcPr>
-            <w:tcW w:type="dxa" w:w="1701"/>
+            <w:tcW w:type="dxa" w:w="794"/>
             <w:vAlign w:val="center"/>
             <w:shd w:fill="DFE8F3"/>
             <w:tcMar>
@@ -6969,14 +9050,65 @@
             <w:pPr>
               <w:keepNext/>
               <w:spacing w:after="20" w:before="20" w:line="240" w:lineRule="auto"/>
-              <w:jc w:val="center"/>
             </w:pPr>
             <w:r>
               <w:rPr>
                 <w:b/>
                 <w:sz w:val="20"/>
               </w:rPr>
-              <w:t>Ошибки</w:t>
+              <w:t>Ош.</w:t>
+            </w:r>
+          </w:p>
+        </w:tc>
+        <w:tc>
+          <w:tcPr>
+            <w:tcW w:type="dxa" w:w="2098"/>
+            <w:vAlign w:val="center"/>
+            <w:shd w:fill="DFE8F3"/>
+            <w:tcMar>
+              <w:top w:w="60" w:type="dxa"/>
+              <w:left w:w="90" w:type="dxa"/>
+              <w:bottom w:w="60" w:type="dxa"/>
+              <w:right w:w="90" w:type="dxa"/>
+            </w:tcMar>
+          </w:tcPr>
+          <w:p>
+            <w:pPr>
+              <w:keepNext/>
+              <w:spacing w:after="20" w:before="20" w:line="240" w:lineRule="auto"/>
+            </w:pPr>
+            <w:r>
+              <w:rPr>
+                <w:b/>
+                <w:sz w:val="20"/>
+              </w:rPr>
+              <w:t>7 окт запросы</w:t>
+            </w:r>
+          </w:p>
+        </w:tc>
+        <w:tc>
+          <w:tcPr>
+            <w:tcW w:type="dxa" w:w="794"/>
+            <w:vAlign w:val="center"/>
+            <w:shd w:fill="DFE8F3"/>
+            <w:tcMar>
+              <w:top w:w="60" w:type="dxa"/>
+              <w:left w:w="90" w:type="dxa"/>
+              <w:bottom w:w="60" w:type="dxa"/>
+              <w:right w:w="90" w:type="dxa"/>
+            </w:tcMar>
+          </w:tcPr>
+          <w:p>
+            <w:pPr>
+              <w:keepNext/>
+              <w:spacing w:after="20" w:before="20" w:line="240" w:lineRule="auto"/>
+            </w:pPr>
+            <w:r>
+              <w:rPr>
+                <w:b/>
+                <w:sz w:val="20"/>
+              </w:rPr>
+              <w:t>Ош.</w:t>
             </w:r>
           </w:p>
         </w:tc>
@@ -6987,7 +9119,7 @@
         </w:trPr>
         <w:tc>
           <w:tcPr>
-            <w:tcW w:type="dxa" w:w="5839"/>
+            <w:tcW w:type="dxa" w:w="3572"/>
             <w:vAlign w:val="center"/>
             <w:shd w:fill="FFFFFF"/>
             <w:tcMar>
@@ -7013,7 +9145,7 @@
         </w:tc>
         <w:tc>
           <w:tcPr>
-            <w:tcW w:type="dxa" w:w="1701"/>
+            <w:tcW w:type="dxa" w:w="1984"/>
             <w:vAlign w:val="center"/>
             <w:shd w:fill="FFFFFF"/>
             <w:tcMar>
@@ -7027,7 +9159,6 @@
             <w:pPr>
               <w:keepNext/>
               <w:spacing w:after="20" w:before="20" w:line="240" w:lineRule="auto"/>
-              <w:jc w:val="center"/>
             </w:pPr>
             <w:r>
               <w:rPr>
@@ -7040,7 +9171,7 @@
         </w:tc>
         <w:tc>
           <w:tcPr>
-            <w:tcW w:type="dxa" w:w="1701"/>
+            <w:tcW w:type="dxa" w:w="794"/>
             <w:vAlign w:val="center"/>
             <w:shd w:fill="FFFFFF"/>
             <w:tcMar>
@@ -7054,7 +9185,58 @@
             <w:pPr>
               <w:keepNext/>
               <w:spacing w:after="20" w:before="20" w:line="240" w:lineRule="auto"/>
-              <w:jc w:val="center"/>
+            </w:pPr>
+            <w:r>
+              <w:rPr>
+                <w:b w:val="0"/>
+                <w:sz w:val="20"/>
+              </w:rPr>
+              <w:t>0</w:t>
+            </w:r>
+          </w:p>
+        </w:tc>
+        <w:tc>
+          <w:tcPr>
+            <w:tcW w:type="dxa" w:w="2098"/>
+            <w:vAlign w:val="center"/>
+            <w:shd w:fill="FFFFFF"/>
+            <w:tcMar>
+              <w:top w:w="60" w:type="dxa"/>
+              <w:left w:w="90" w:type="dxa"/>
+              <w:bottom w:w="60" w:type="dxa"/>
+              <w:right w:w="90" w:type="dxa"/>
+            </w:tcMar>
+          </w:tcPr>
+          <w:p>
+            <w:pPr>
+              <w:keepNext/>
+              <w:spacing w:after="20" w:before="20" w:line="240" w:lineRule="auto"/>
+            </w:pPr>
+            <w:r>
+              <w:rPr>
+                <w:b w:val="0"/>
+                <w:sz w:val="20"/>
+              </w:rPr>
+              <w:t>6</w:t>
+            </w:r>
+          </w:p>
+        </w:tc>
+        <w:tc>
+          <w:tcPr>
+            <w:tcW w:type="dxa" w:w="794"/>
+            <w:vAlign w:val="center"/>
+            <w:shd w:fill="FFFFFF"/>
+            <w:tcMar>
+              <w:top w:w="60" w:type="dxa"/>
+              <w:left w:w="90" w:type="dxa"/>
+              <w:bottom w:w="60" w:type="dxa"/>
+              <w:right w:w="90" w:type="dxa"/>
+            </w:tcMar>
+          </w:tcPr>
+          <w:p>
+            <w:pPr>
+              <w:keepNext/>
+              <w:spacing w:after="20" w:before="20" w:line="240" w:lineRule="auto"/>
             </w:pPr>
             <w:r>
               <w:rPr>
@@ -7072,7 +9254,7 @@
         </w:trPr>
         <w:tc>
           <w:tcPr>
-            <w:tcW w:type="dxa" w:w="5839"/>
+            <w:tcW w:type="dxa" w:w="3572"/>
             <w:vAlign w:val="center"/>
             <w:shd w:fill="F5F7FA"/>
             <w:tcMar>
@@ -7098,7 +9280,7 @@
         </w:tc>
         <w:tc>
           <w:tcPr>
-            <w:tcW w:type="dxa" w:w="1701"/>
+            <w:tcW w:type="dxa" w:w="1984"/>
             <w:vAlign w:val="center"/>
             <w:shd w:fill="F5F7FA"/>
             <w:tcMar>
@@ -7112,7 +9294,6 @@
             <w:pPr>
               <w:keepNext/>
               <w:spacing w:after="20" w:before="20" w:line="240" w:lineRule="auto"/>
-              <w:jc w:val="center"/>
             </w:pPr>
             <w:r>
               <w:rPr>
@@ -7125,7 +9306,7 @@
         </w:tc>
         <w:tc>
           <w:tcPr>
-            <w:tcW w:type="dxa" w:w="1701"/>
+            <w:tcW w:type="dxa" w:w="794"/>
             <w:vAlign w:val="center"/>
             <w:shd w:fill="F5F7FA"/>
             <w:tcMar>
@@ -7139,7 +9320,58 @@
             <w:pPr>
               <w:keepNext/>
               <w:spacing w:after="20" w:before="20" w:line="240" w:lineRule="auto"/>
-              <w:jc w:val="center"/>
+            </w:pPr>
+            <w:r>
+              <w:rPr>
+                <w:b w:val="0"/>
+                <w:sz w:val="20"/>
+              </w:rPr>
+              <w:t>0</w:t>
+            </w:r>
+          </w:p>
+        </w:tc>
+        <w:tc>
+          <w:tcPr>
+            <w:tcW w:type="dxa" w:w="2098"/>
+            <w:vAlign w:val="center"/>
+            <w:shd w:fill="F5F7FA"/>
+            <w:tcMar>
+              <w:top w:w="60" w:type="dxa"/>
+              <w:left w:w="90" w:type="dxa"/>
+              <w:bottom w:w="60" w:type="dxa"/>
+              <w:right w:w="90" w:type="dxa"/>
+            </w:tcMar>
+          </w:tcPr>
+          <w:p>
+            <w:pPr>
+              <w:keepNext/>
+              <w:spacing w:after="20" w:before="20" w:line="240" w:lineRule="auto"/>
+            </w:pPr>
+            <w:r>
+              <w:rPr>
+                <w:b w:val="0"/>
+                <w:sz w:val="20"/>
+              </w:rPr>
+              <w:t>6</w:t>
+            </w:r>
+          </w:p>
+        </w:tc>
+        <w:tc>
+          <w:tcPr>
+            <w:tcW w:type="dxa" w:w="794"/>
+            <w:vAlign w:val="center"/>
+            <w:shd w:fill="F5F7FA"/>
+            <w:tcMar>
+              <w:top w:w="60" w:type="dxa"/>
+              <w:left w:w="90" w:type="dxa"/>
+              <w:bottom w:w="60" w:type="dxa"/>
+              <w:right w:w="90" w:type="dxa"/>
+            </w:tcMar>
+          </w:tcPr>
+          <w:p>
+            <w:pPr>
+              <w:keepNext/>
+              <w:spacing w:after="20" w:before="20" w:line="240" w:lineRule="auto"/>
             </w:pPr>
             <w:r>
               <w:rPr>
@@ -7157,7 +9389,7 @@
         </w:trPr>
         <w:tc>
           <w:tcPr>
-            <w:tcW w:type="dxa" w:w="5839"/>
+            <w:tcW w:type="dxa" w:w="3572"/>
             <w:vAlign w:val="center"/>
             <w:shd w:fill="FFFFFF"/>
             <w:tcMar>
@@ -7183,7 +9415,7 @@
         </w:tc>
         <w:tc>
           <w:tcPr>
-            <w:tcW w:type="dxa" w:w="1701"/>
+            <w:tcW w:type="dxa" w:w="1984"/>
             <w:vAlign w:val="center"/>
             <w:shd w:fill="FFFFFF"/>
             <w:tcMar>
@@ -7197,7 +9429,6 @@
             <w:pPr>
               <w:keepNext/>
               <w:spacing w:after="20" w:before="20" w:line="240" w:lineRule="auto"/>
-              <w:jc w:val="center"/>
             </w:pPr>
             <w:r>
               <w:rPr>
@@ -7210,7 +9441,7 @@
         </w:tc>
         <w:tc>
           <w:tcPr>
-            <w:tcW w:type="dxa" w:w="1701"/>
+            <w:tcW w:type="dxa" w:w="794"/>
             <w:vAlign w:val="center"/>
             <w:shd w:fill="FFFFFF"/>
             <w:tcMar>
@@ -7224,7 +9455,58 @@
             <w:pPr>
               <w:keepNext/>
               <w:spacing w:after="20" w:before="20" w:line="240" w:lineRule="auto"/>
-              <w:jc w:val="center"/>
+            </w:pPr>
+            <w:r>
+              <w:rPr>
+                <w:b w:val="0"/>
+                <w:sz w:val="20"/>
+              </w:rPr>
+              <w:t>0</w:t>
+            </w:r>
+          </w:p>
+        </w:tc>
+        <w:tc>
+          <w:tcPr>
+            <w:tcW w:type="dxa" w:w="2098"/>
+            <w:vAlign w:val="center"/>
+            <w:shd w:fill="FFFFFF"/>
+            <w:tcMar>
+              <w:top w:w="60" w:type="dxa"/>
+              <w:left w:w="90" w:type="dxa"/>
+              <w:bottom w:w="60" w:type="dxa"/>
+              <w:right w:w="90" w:type="dxa"/>
+            </w:tcMar>
+          </w:tcPr>
+          <w:p>
+            <w:pPr>
+              <w:keepNext/>
+              <w:spacing w:after="20" w:before="20" w:line="240" w:lineRule="auto"/>
+            </w:pPr>
+            <w:r>
+              <w:rPr>
+                <w:b w:val="0"/>
+                <w:sz w:val="20"/>
+              </w:rPr>
+              <w:t>165</w:t>
+            </w:r>
+          </w:p>
+        </w:tc>
+        <w:tc>
+          <w:tcPr>
+            <w:tcW w:type="dxa" w:w="794"/>
+            <w:vAlign w:val="center"/>
+            <w:shd w:fill="FFFFFF"/>
+            <w:tcMar>
+              <w:top w:w="60" w:type="dxa"/>
+              <w:left w:w="90" w:type="dxa"/>
+              <w:bottom w:w="60" w:type="dxa"/>
+              <w:right w:w="90" w:type="dxa"/>
+            </w:tcMar>
+          </w:tcPr>
+          <w:p>
+            <w:pPr>
+              <w:keepNext/>
+              <w:spacing w:after="20" w:before="20" w:line="240" w:lineRule="auto"/>
             </w:pPr>
             <w:r>
               <w:rPr>
@@ -7242,7 +9524,7 @@
         </w:trPr>
         <w:tc>
           <w:tcPr>
-            <w:tcW w:type="dxa" w:w="5839"/>
+            <w:tcW w:type="dxa" w:w="3572"/>
             <w:vAlign w:val="center"/>
             <w:shd w:fill="F5F7FA"/>
             <w:tcMar>
@@ -7268,7 +9550,7 @@
         </w:tc>
         <w:tc>
           <w:tcPr>
-            <w:tcW w:type="dxa" w:w="1701"/>
+            <w:tcW w:type="dxa" w:w="1984"/>
             <w:vAlign w:val="center"/>
             <w:shd w:fill="F5F7FA"/>
             <w:tcMar>
@@ -7282,7 +9564,6 @@
             <w:pPr>
               <w:keepNext w:val="0"/>
               <w:spacing w:after="20" w:before="20" w:line="240" w:lineRule="auto"/>
-              <w:jc w:val="center"/>
             </w:pPr>
             <w:r>
               <w:rPr>
@@ -7295,7 +9576,7 @@
         </w:tc>
         <w:tc>
           <w:tcPr>
-            <w:tcW w:type="dxa" w:w="1701"/>
+            <w:tcW w:type="dxa" w:w="794"/>
             <w:vAlign w:val="center"/>
             <w:shd w:fill="F5F7FA"/>
             <w:tcMar>
@@ -7309,7 +9590,58 @@
             <w:pPr>
               <w:keepNext w:val="0"/>
               <w:spacing w:after="20" w:before="20" w:line="240" w:lineRule="auto"/>
-              <w:jc w:val="center"/>
+            </w:pPr>
+            <w:r>
+              <w:rPr>
+                <w:b w:val="0"/>
+                <w:sz w:val="20"/>
+              </w:rPr>
+              <w:t>0</w:t>
+            </w:r>
+          </w:p>
+        </w:tc>
+        <w:tc>
+          <w:tcPr>
+            <w:tcW w:type="dxa" w:w="2098"/>
+            <w:vAlign w:val="center"/>
+            <w:shd w:fill="F5F7FA"/>
+            <w:tcMar>
+              <w:top w:w="60" w:type="dxa"/>
+              <w:left w:w="90" w:type="dxa"/>
+              <w:bottom w:w="60" w:type="dxa"/>
+              <w:right w:w="90" w:type="dxa"/>
+            </w:tcMar>
+          </w:tcPr>
+          <w:p>
+            <w:pPr>
+              <w:keepNext w:val="0"/>
+              <w:spacing w:after="20" w:before="20" w:line="240" w:lineRule="auto"/>
+            </w:pPr>
+            <w:r>
+              <w:rPr>
+                <w:b w:val="0"/>
+                <w:sz w:val="20"/>
+              </w:rPr>
+              <w:t>161</w:t>
+            </w:r>
+          </w:p>
+        </w:tc>
+        <w:tc>
+          <w:tcPr>
+            <w:tcW w:type="dxa" w:w="794"/>
+            <w:vAlign w:val="center"/>
+            <w:shd w:fill="F5F7FA"/>
+            <w:tcMar>
+              <w:top w:w="60" w:type="dxa"/>
+              <w:left w:w="90" w:type="dxa"/>
+              <w:bottom w:w="60" w:type="dxa"/>
+              <w:right w:w="90" w:type="dxa"/>
+            </w:tcMar>
+          </w:tcPr>
+          <w:p>
+            <w:pPr>
+              <w:keepNext w:val="0"/>
+              <w:spacing w:after="20" w:before="20" w:line="240" w:lineRule="auto"/>
             </w:pPr>
             <w:r>
               <w:rPr>
@@ -7350,7 +9682,15 @@
         <w:rPr>
           <w:b w:val="0"/>
         </w:rPr>
-        <w:t>Прогон выполнен на одном Windows-компьютере до обновления базового образа. Бизнес-код совпадает, финальный образ отдельно прошёл smoke и миграции. У четырёх первых подключений наблюдался TCP Connect 2617–8038 мс; эти значения соответствуют длинному хвосту и требуют анализа при полноценном испытании. p99=2644 мс нельзя скрывать за успешно пройденным p95 gate.</w:t>
+        <w:t>Прогон выполнен 6 октября на одном Windows-компьютере до обновления базового образа и до Core-рефакторинга 7 октября. Обновлённый 6 октября образ отдельно прошёл smoke и миграции; это не проверка нынешнего backend. У четырёх первых подключений наблюдался TCP Connect 2617–8038 мс; эти значения соответствуют длинному хвосту и требуют анализа при полноценном испытании. p99=2644 мс нельзя скрывать за успешно пройденным p95 gate.</w:t>
+      </w:r>
+    </w:p>
+    <w:p>
+      <w:r>
+        <w:rPr>
+          <w:b w:val="0"/>
+        </w:rPr>
+        <w:t>В итоговом прогоне 7 октября четыре больших ConnectMs равны 8027, 7574, 3079 и 2577 мс; p99=2602 мс остаётся высоким при p95=26 мс. Это длинный хвост начальных подключений локального Windows-стенда; его причину нужно исследовать в длительном двухмашинном прогоне.</w:t>
       </w:r>
     </w:p>
     <w:p>
@@ -7368,6 +9708,14 @@
       </w:pPr>
       <w:r>
         <w:t>9 Дополнительные модули</w:t>
+      </w:r>
+    </w:p>
+    <w:p>
+      <w:r>
+        <w:rPr>
+          <w:b w:val="0"/>
+        </w:rPr>
+        <w:t>Исправление базового образа и восстановление БД проверены 6 октября до изменения архитектуры. Новая Core-сборка дополнительно прошла Trivy 7 октября; результаты двух сканирований разделены ниже.</w:t>
       </w:r>
     </w:p>
     <w:p>
@@ -7734,6 +10082,35 @@
           <w:sz w:val="17"/>
         </w:rPr>
         <w:t>sha256:3bdc7a5c0c273331877efe595df693e22eb0ac53f22b55abf36b1264f7a18ac6</w:t>
+      </w:r>
+    </w:p>
+    <w:p>
+      <w:r>
+        <w:rPr>
+          <w:b w:val="0"/>
+        </w:rPr>
+        <w:t>7 октября отдельно просканирована исправленная сборка game-radar:core-refactor. Trivy 0.75.0 для Debian 13.7 показал 0 CRITICAL и 0 secret findings; gate завершился с exit 0. Это отдельный локальный запуск, а не выполненная стадия учебного Jenkins.</w:t>
+      </w:r>
+    </w:p>
+    <w:p>
+      <w:r>
+        <w:rPr>
+          <w:b w:val="0"/>
+        </w:rPr>
+        <w:t>Artifact ID сканирования новой сборки 7 октября</w:t>
+      </w:r>
+    </w:p>
+    <w:p>
+      <w:pPr>
+        <w:spacing w:after="100" w:line="200" w:lineRule="exact"/>
+      </w:pPr>
+      <w:r>
+        <w:rPr>
+          <w:rFonts w:ascii="Liberation Mono" w:hAnsi="Liberation Mono"/>
+          <w:b w:val="0"/>
+          <w:sz w:val="17"/>
+        </w:rPr>
+        <w:t>sha256:43b4912e93624fffa36ece283c165ae76dd8b66ac8d0ac4a0df970346139f1d4</w:t>
       </w:r>
     </w:p>
     <w:p>
@@ -8447,7 +10824,7 @@
                 <w:b w:val="0"/>
                 <w:sz w:val="20"/>
               </w:rPr>
-              <w:t>Исходники в локальном Git</w:t>
+              <w:t>Репозиторий и исходники подготовлены</w:t>
             </w:r>
           </w:p>
         </w:tc>
@@ -8472,7 +10849,7 @@
                 <w:b w:val="0"/>
                 <w:sz w:val="20"/>
               </w:rPr>
-              <w:t>Опубликовать новые исходники</w:t>
+              <w:t>Опубликовать проверенный рефакторинг</w:t>
             </w:r>
           </w:p>
         </w:tc>
@@ -8527,7 +10904,7 @@
                 <w:b w:val="0"/>
                 <w:sz w:val="20"/>
               </w:rPr>
-              <w:t>PostgreSQL и 7 healthy локально</w:t>
+              <w:t>Новая сборка и PostgreSQL проверены 7 октября</w:t>
             </w:r>
           </w:p>
         </w:tc>
@@ -8552,7 +10929,7 @@
                 <w:b w:val="0"/>
                 <w:sz w:val="20"/>
               </w:rPr>
-              <w:t>Показать Compose и данные</w:t>
+              <w:t>Показать Compose и данные на двух хостах</w:t>
             </w:r>
           </w:p>
         </w:tc>
@@ -8767,7 +11144,7 @@
                 <w:b w:val="0"/>
                 <w:sz w:val="20"/>
               </w:rPr>
-              <w:t>59 тестов и Ruff пройдены</w:t>
+              <w:t>Результаты двух версий в разделе 8</w:t>
             </w:r>
           </w:p>
         </w:tc>
@@ -8847,7 +11224,7 @@
                 <w:b w:val="0"/>
                 <w:sz w:val="20"/>
               </w:rPr>
-              <w:t>Локально проверены</w:t>
+              <w:t>Исходная версия проверена 6 октября</w:t>
             </w:r>
           </w:p>
         </w:tc>
@@ -8872,7 +11249,7 @@
                 <w:b w:val="0"/>
                 <w:sz w:val="20"/>
               </w:rPr>
-              <w:t>Smoke после CI и графики</w:t>
+              <w:t>Smoke новой сборки и графики</w:t>
             </w:r>
           </w:p>
         </w:tc>
@@ -8927,7 +11304,7 @@
                 <w:b w:val="0"/>
                 <w:sz w:val="20"/>
               </w:rPr>
-              <w:t>uid 10001 проверен</w:t>
+              <w:t>uid 10001 проверен 6 октября</w:t>
             </w:r>
           </w:p>
         </w:tc>
@@ -9087,7 +11464,7 @@
                 <w:b w:val="0"/>
                 <w:sz w:val="20"/>
               </w:rPr>
-              <w:t>Короткий локальный прогон</w:t>
+              <w:t>Короткие локальные прогоны 6 и 7 октября</w:t>
             </w:r>
           </w:p>
         </w:tc>
@@ -9167,7 +11544,7 @@
                 <w:b w:val="0"/>
                 <w:sz w:val="20"/>
               </w:rPr>
-              <w:t>Оба проверены локально</w:t>
+              <w:t>Trivy 7 октября, backup/restore 6 октября</w:t>
             </w:r>
           </w:p>
         </w:tc>
@@ -9192,7 +11569,7 @@
                 <w:b w:val="0"/>
                 <w:sz w:val="20"/>
               </w:rPr>
-              <w:t>Стадия Jenkins и restore на защите</w:t>
+              <w:t>Стадия Jenkins и restore новой версии</w:t>
             </w:r>
           </w:p>
         </w:tc>
@@ -9328,7 +11705,15 @@
         <w:rPr>
           <w:b w:val="0"/>
         </w:rPr>
-        <w:t>Подготовлен backend с отдельными Use Cases, PostgreSQL, Swagger, автономным mock и интеграцией CheapShark. Локально подтверждены 59 тестов, конкурентные операции, семь healthy-сервисов, мониторинг, проверка Trivy и восстановление БД. Короткий JMeter-прогон завершился без ошибок, но зафиксировал длинный хвост первых подключений.</w:t>
+        <w:t>7 октября backend приведён к архитектуре frozen Use Cases, Dispatcher, Handlers, Core repositories, Pydantic DTO и dataclass Views. Таблицы сгенерированы sqlacodegen из исходной миграции. Результаты 6 октября (baseline 2e2f3e3) сохранены как измерения исходной версии: 59 тестов, PostgreSQL-конкуренция, семь healthy-сервисов, мониторинг, Trivy и восстановление. Короткий JMeter-прогон не имел ошибок, но показал длинный хвост первых подключений.</w:t>
+      </w:r>
+    </w:p>
+    <w:p>
+      <w:r>
+        <w:rPr>
+          <w:b w:val="0"/>
+        </w:rPr>
+        <w:t>Новая архитектура проверена отдельно: pytest — 134 passed. Остальные результаты обновлённой версии приведены в разделе 8; измерения 6 октября не переносятся на новую сборку автоматически.</w:t>
       </w:r>
     </w:p>
     <w:p>
@@ -9907,6 +12292,22 @@
         <w:rPr>
           <w:b w:val="0"/>
         </w:rPr>
+        <w:t>Use Case Pattern — FastAPI + sqlacodegen + SQLAlchemy Core + Pydantic: материал задания, обновлён 7 ноября 2025 года</w:t>
+      </w:r>
+    </w:p>
+    <w:p>
+      <w:r>
+        <w:rPr>
+          <w:b w:val="0"/>
+        </w:rPr>
+        <w:t>Согласованный контракт API GameRadar 0.2.0: doc/game-radar-api.yaml</w:t>
+      </w:r>
+    </w:p>
+    <w:p>
+      <w:r>
+        <w:rPr>
+          <w:b w:val="0"/>
+        </w:rPr>
         <w:t>Документация CheapShark: https://apidocs.cheapshark.com/</w:t>
       </w:r>
     </w:p>
@@ -9940,14 +12341,6 @@
           <w:b w:val="0"/>
         </w:rPr>
         <w:t>Репозиторий: https://github.com/Mink7891/backend-deployment-project</w:t>
-      </w:r>
-    </w:p>
-    <w:p>
-      <w:r>
-        <w:rPr>
-          <w:b w:val="0"/>
-        </w:rPr>
-        <w:t>Новые файлы реализации на момент локальной проверки ещё не опубликованы в удалённом репозитории. Перед сдачей требуется commit и push проверенного состояния.</w:t>
       </w:r>
     </w:p>
     <w:p>
@@ -10380,7 +12773,7 @@
           <w:b w:val="0"/>
           <w:sz w:val="17"/>
         </w:rPr>
-        <w:t>CMD ["uvicorn", "app.main:app", "--host", "0.0.0.0", "--port", "8000"]</w:t>
+        <w:t>CMD ["uvicorn", "app.main:app", "--host", "0.0.0.0", "--port", "8000", "--no-access-log"]</w:t>
       </w:r>
     </w:p>
     <w:p>
@@ -10982,7 +13375,7 @@
           <w:b w:val="0"/>
           <w:sz w:val="17"/>
         </w:rPr>
-        <w:t xml:space="preserve">    command: [sh, -c, 'alembic upgrade head &amp;&amp; exec uvicorn app.main:app --host 0.0.0.0 --port 8000']</w:t>
+        <w:t xml:space="preserve">    command: [sh, -c, 'alembic upgrade head &amp;&amp; exec uvicorn app.main:app --host 0.0.0.0 --port 8000 --no-access-log']</w:t>
       </w:r>
     </w:p>
     <w:p>
@@ -13262,6 +15655,19 @@
           <w:sz w:val="17"/>
         </w:rPr>
         <w:t xml:space="preserve">                    uv sync --locked --group dev --python 3.12</w:t>
+      </w:r>
+    </w:p>
+    <w:p>
+      <w:pPr>
+        <w:spacing w:after="0" w:line="200" w:lineRule="exact"/>
+      </w:pPr>
+      <w:r>
+        <w:rPr>
+          <w:rFonts w:ascii="Liberation Mono" w:hAnsi="Liberation Mono"/>
+          <w:b w:val="0"/>
+          <w:sz w:val="17"/>
+        </w:rPr>
+        <w:t xml:space="preserve">                    uv run --no-sync python scripts/generate_schemas.py --check</w:t>
       </w:r>
     </w:p>
     <w:p>

</xml_diff>